<commit_message>
Combine both demos into one script (RetailTrack + Fabric Lens)
Single demo script with two parts:
- Part A · RetailTrack — the existing store-floor content (people, manager
  screen, heat-map, best customer, live alerts)
- Part B · Fabric Lens — matches the recorded QSR software (Live Wall,
  Stations 1-3, Ops Board, Inventory, Insights & Alerts)

Shared pre-flight checklist, a combined "how to close" (two products, one
platform) and a merged Q&A that answers for both store and kitchen.
Updated the Word (.docx, plain) and PDF/HTML presenter versions. Total ~9:45
for both (RetailTrack 4:20 + Fabric Lens 5:25).

Co-Authored-By: Claude Opus 4.8 <noreply@anthropic.com>
Claude-Session: https://claude.ai/code/session_01E1oR723ai5CKXUc9it1VkB
</commit_message>
<xml_diff>
--- a/deck/EdgeVision-Demo-Script.docx
+++ b/deck/EdgeVision-Demo-Script.docx
@@ -27,7 +27,7 @@
           <w:sz w:val="20"/>
           <w:szCs w:val="20"/>
         </w:rPr>
-        <w:t xml:space="preserve">Fabric Lens · live software walkthrough · Intel Event</w:t>
+        <w:t xml:space="preserve">RetailTrack + Fabric Lens · live software walkthrough · Intel Event</w:t>
       </w:r>
     </w:p>
     <w:p>
@@ -43,7 +43,7 @@
           <w:sz w:val="18"/>
           <w:szCs w:val="18"/>
         </w:rPr>
-        <w:t xml:space="preserve">About 5:25 · Pattern AI Labs</w:t>
+        <w:t xml:space="preserve">About 9:45 for both · Pattern AI Labs</w:t>
       </w:r>
     </w:p>
     <w:p>
@@ -118,7 +118,7 @@
         <w:pBdr>
           <w:bottom w:val="single" w:color="000000" w:sz="8" w:space="4"/>
         </w:pBdr>
-        <w:spacing w:after="120" w:before="300"/>
+        <w:spacing w:after="120" w:before="320"/>
       </w:pPr>
       <w:r>
         <w:rPr>
@@ -146,7 +146,7 @@
           <w:sz w:val="20"/>
           <w:szCs w:val="20"/>
         </w:rPr>
-        <w:t xml:space="preserve">Laptop connected to the projector; screen mirrored and tested. Sound on — the alerts have a chime.</w:t>
+        <w:t xml:space="preserve">Laptop connected to the projector; screen mirrored and tested. Sound on — some steps have an alert chime.</w:t>
       </w:r>
     </w:p>
     <w:p>
@@ -164,7 +164,7 @@
           <w:sz w:val="20"/>
           <w:szCs w:val="20"/>
         </w:rPr>
-        <w:t xml:space="preserve">Fabric Lens open and full-screen. Know the tabs: Live Wall · Ops Board · Inventory · Insights · Alerts.</w:t>
+        <w:t xml:space="preserve">Both apps open and full-screen: RetailTrack (the store floor) and Fabric Lens (the kitchen). Know which you’re showing.</w:t>
       </w:r>
     </w:p>
     <w:p>
@@ -236,7 +236,7 @@
           <w:sz w:val="20"/>
           <w:szCs w:val="20"/>
         </w:rPr>
-        <w:t xml:space="preserve">Open with one line: “This is our software running live on an ordinary quick-service kitchen.”</w:t>
+        <w:t xml:space="preserve">Open with one line: “This is our software running live — the same idea in a store and in a kitchen.”</w:t>
       </w:r>
     </w:p>
     <w:p>
@@ -247,7 +247,7 @@
         <w:tabs>
           <w:tab w:val="right" w:pos="9360"/>
         </w:tabs>
-        <w:spacing w:after="120" w:before="300"/>
+        <w:spacing w:after="120" w:before="320"/>
       </w:pPr>
       <w:r>
         <w:rPr>
@@ -257,7 +257,7 @@
           <w:sz w:val="24"/>
           <w:szCs w:val="24"/>
         </w:rPr>
-        <w:t xml:space="preserve">The walkthrough</w:t>
+        <w:t xml:space="preserve">Part A · RetailTrack — the store floor</w:t>
       </w:r>
       <w:r>
         <w:rPr>
@@ -265,7 +265,7 @@
           <w:sz w:val="18"/>
           <w:szCs w:val="18"/>
         </w:rPr>
-        <w:t xml:space="preserve">	about 5:25</w:t>
+        <w:t xml:space="preserve">	about 4:20</w:t>
       </w:r>
     </w:p>
     <w:p>
@@ -283,7 +283,7 @@
           <w:sz w:val="22"/>
           <w:szCs w:val="22"/>
         </w:rPr>
-        <w:t xml:space="preserve">1. The whole restaurant on one screen</w:t>
+        <w:t xml:space="preserve">1. People, seen clearly</w:t>
       </w:r>
       <w:r>
         <w:rPr>
@@ -291,7 +291,7 @@
           <w:sz w:val="18"/>
           <w:szCs w:val="18"/>
         </w:rPr>
-        <w:t xml:space="preserve">	(0:30)</w:t>
+        <w:t xml:space="preserve">	(0:45)</w:t>
       </w:r>
     </w:p>
     <w:tbl>
@@ -368,7 +368,7 @@
                 <w:sz w:val="20"/>
                 <w:szCs w:val="20"/>
               </w:rPr>
-              <w:t xml:space="preserve">The Live Wall — every camera at once: the make-line stations, the fryer, the storeroom shelves, and the back door.</w:t>
+              <w:t xml:space="preserve">Store floor — coloured boxes follow each person; staff in amber, customers in cyan.</w:t>
             </w:r>
           </w:p>
         </w:tc>
@@ -431,7 +431,7 @@
                 <w:sz w:val="21"/>
                 <w:szCs w:val="21"/>
               </w:rPr>
-              <w:t xml:space="preserve">“This is the whole restaurant on one screen — the front line, the fryer, the storeroom, even the delivery door. One system watches all of it, live. Everything I show next is happening on these same cameras.”</w:t>
+              <w:t xml:space="preserve">“This is a normal store camera. Our software marks every person — amber for your staff, cyan for a customer. It does this on its own, and it never saves anyone’s face.”</w:t>
             </w:r>
           </w:p>
         </w:tc>
@@ -494,7 +494,7 @@
                 <w:sz w:val="20"/>
                 <w:szCs w:val="20"/>
               </w:rPr>
-              <w:t xml:space="preserve">Point out a make-line station, the fryer, and the storeroom shelves.</w:t>
+              <w:t xml:space="preserve">Point to one amber box and one cyan box as they move.</w:t>
             </w:r>
           </w:p>
         </w:tc>
@@ -515,7 +515,7 @@
           <w:sz w:val="22"/>
           <w:szCs w:val="22"/>
         </w:rPr>
-        <w:t xml:space="preserve">2. Station 1 — is the order right?</w:t>
+        <w:t xml:space="preserve">2. One screen for the manager</w:t>
       </w:r>
       <w:r>
         <w:rPr>
@@ -523,7 +523,7 @@
           <w:sz w:val="18"/>
           <w:szCs w:val="18"/>
         </w:rPr>
-        <w:t xml:space="preserve">	(1:00)</w:t>
+        <w:t xml:space="preserve">	(0:45)</w:t>
       </w:r>
     </w:p>
     <w:tbl>
@@ -600,7 +600,7 @@
                 <w:sz w:val="20"/>
                 <w:szCs w:val="20"/>
               </w:rPr>
-              <w:t xml:space="preserve">Station 1, looking down at the box. It reads the ticket (a Box Combo) and checks every item. A red line appears: “Drop a slice of Texas toast in the box.”</w:t>
+              <w:t xml:space="preserve">The manager’s screen — people in today, staff on the floor, alerts, and a busy-hours chart.</w:t>
             </w:r>
           </w:p>
         </w:tc>
@@ -663,7 +663,7 @@
                 <w:sz w:val="21"/>
                 <w:szCs w:val="21"/>
               </w:rPr>
-              <w:t xml:space="preserve">“Station one checks the order before it’s bagged. The camera reads the ticket and counts what’s actually in the box — and it’s caught a missing Texas toast. The screen tells the team exactly what to add.”</w:t>
+              <w:t xml:space="preserve">“This is the only screen a manager needs. How many people came in, how many staff are on the floor, what needs attention now, and the busy hours — all on one page.”</w:t>
             </w:r>
           </w:p>
         </w:tc>
@@ -726,133 +726,7 @@
                 <w:sz w:val="20"/>
                 <w:szCs w:val="20"/>
               </w:rPr>
-              <w:t xml:space="preserve">Point to the alert line, then to the ticket checklist on the right.</w:t>
-            </w:r>
-          </w:p>
-        </w:tc>
-      </w:tr>
-      <w:tr>
-        <w:tc>
-          <w:tcPr>
-            <w:tcW w:type="dxa" w:w="1000"/>
-            <w:tcBorders>
-              <w:top w:val="none" w:color="FFFFFF" w:sz="0"/>
-              <w:left w:val="none" w:color="FFFFFF" w:sz="0"/>
-              <w:bottom w:val="none" w:color="FFFFFF" w:sz="0"/>
-              <w:right w:val="none" w:color="FFFFFF" w:sz="0"/>
-            </w:tcBorders>
-            <w:tcMar>
-              <w:top w:type="dxa" w:w="30"/>
-              <w:left w:type="dxa" w:w="0"/>
-              <w:bottom w:type="dxa" w:w="30"/>
-              <w:right w:type="dxa" w:w="160"/>
-            </w:tcMar>
-          </w:tcPr>
-          <w:p>
-            <w:r>
-              <w:rPr>
-                <w:b/>
-                <w:bCs/>
-                <w:color w:val="000000"/>
-                <w:sz w:val="20"/>
-                <w:szCs w:val="20"/>
-              </w:rPr>
-              <w:t xml:space="preserve">Show</w:t>
-            </w:r>
-          </w:p>
-        </w:tc>
-        <w:tc>
-          <w:tcPr>
-            <w:tcW w:type="dxa" w:w="8360"/>
-            <w:tcBorders>
-              <w:top w:val="none" w:color="FFFFFF" w:sz="0"/>
-              <w:left w:val="none" w:color="FFFFFF" w:sz="0"/>
-              <w:bottom w:val="none" w:color="FFFFFF" w:sz="0"/>
-              <w:right w:val="none" w:color="FFFFFF" w:sz="0"/>
-            </w:tcBorders>
-            <w:tcMar>
-              <w:top w:type="dxa" w:w="30"/>
-              <w:left w:type="dxa" w:w="0"/>
-              <w:bottom w:type="dxa" w:w="30"/>
-              <w:right w:type="dxa" w:w="0"/>
-            </w:tcMar>
-          </w:tcPr>
-          <w:p>
-            <w:pPr>
-              <w:spacing w:line="264"/>
-            </w:pPr>
-            <w:r>
-              <w:rPr>
-                <w:i w:val="false"/>
-                <w:iCs w:val="false"/>
-                <w:color w:val="000000"/>
-                <w:sz w:val="20"/>
-                <w:szCs w:val="20"/>
-              </w:rPr>
-              <w:t xml:space="preserve">The toast goes in; the team taps Re-check; the panel turns green — “Order complete · Ready, bag it.”</w:t>
-            </w:r>
-          </w:p>
-        </w:tc>
-      </w:tr>
-      <w:tr>
-        <w:tc>
-          <w:tcPr>
-            <w:tcW w:type="dxa" w:w="1000"/>
-            <w:tcBorders>
-              <w:top w:val="none" w:color="FFFFFF" w:sz="0"/>
-              <w:left w:val="none" w:color="FFFFFF" w:sz="0"/>
-              <w:bottom w:val="none" w:color="FFFFFF" w:sz="0"/>
-              <w:right w:val="none" w:color="FFFFFF" w:sz="0"/>
-            </w:tcBorders>
-            <w:tcMar>
-              <w:top w:type="dxa" w:w="30"/>
-              <w:left w:type="dxa" w:w="0"/>
-              <w:bottom w:type="dxa" w:w="30"/>
-              <w:right w:type="dxa" w:w="160"/>
-            </w:tcMar>
-          </w:tcPr>
-          <w:p>
-            <w:r>
-              <w:rPr>
-                <w:b/>
-                <w:bCs/>
-                <w:color w:val="000000"/>
-                <w:sz w:val="20"/>
-                <w:szCs w:val="20"/>
-              </w:rPr>
-              <w:t xml:space="preserve">Say</w:t>
-            </w:r>
-          </w:p>
-        </w:tc>
-        <w:tc>
-          <w:tcPr>
-            <w:tcW w:type="dxa" w:w="8360"/>
-            <w:tcBorders>
-              <w:top w:val="none" w:color="FFFFFF" w:sz="0"/>
-              <w:left w:val="none" w:color="FFFFFF" w:sz="0"/>
-              <w:bottom w:val="none" w:color="FFFFFF" w:sz="0"/>
-              <w:right w:val="none" w:color="FFFFFF" w:sz="0"/>
-            </w:tcBorders>
-            <w:tcMar>
-              <w:top w:type="dxa" w:w="30"/>
-              <w:left w:type="dxa" w:w="0"/>
-              <w:bottom w:type="dxa" w:w="30"/>
-              <w:right w:type="dxa" w:w="0"/>
-            </w:tcMar>
-          </w:tcPr>
-          <w:p>
-            <w:pPr>
-              <w:spacing w:line="264"/>
-            </w:pPr>
-            <w:r>
-              <w:rPr>
-                <w:i w:val="false"/>
-                <w:iCs w:val="false"/>
-                <w:color w:val="000000"/>
-                <w:sz w:val="21"/>
-                <w:szCs w:val="21"/>
-              </w:rPr>
-              <w:t xml:space="preserve">“They add it, re-check, and it clears to green. A wrong order fixed before it ever left the counter.”</w:t>
+              <w:t xml:space="preserve">Trace the busy-hours line with your finger and stop on the tallest point.</w:t>
             </w:r>
           </w:p>
         </w:tc>
@@ -873,7 +747,7 @@
           <w:sz w:val="22"/>
           <w:szCs w:val="22"/>
         </w:rPr>
-        <w:t xml:space="preserve">3. Station 2 — is it cooked right?</w:t>
+        <w:t xml:space="preserve">3. Where people spend time</w:t>
       </w:r>
       <w:r>
         <w:rPr>
@@ -958,7 +832,7 @@
                 <w:sz w:val="20"/>
                 <w:szCs w:val="20"/>
               </w:rPr>
-              <w:t xml:space="preserve">Station 2, two cooked tenders side by side, graded against the ideal. Batch score 95%. One is flagged: “Pull the over-fried tender, drop a fresh one.”</w:t>
+              <w:t xml:space="preserve">The heat-map — busy spots glow red; a list shows the top areas.</w:t>
             </w:r>
           </w:p>
         </w:tc>
@@ -1021,7 +895,7 @@
                 <w:sz w:val="21"/>
                 <w:szCs w:val="21"/>
               </w:rPr>
-              <w:t xml:space="preserve">“Station two grades how the food is cooked. It compares each piece to the ideal — colour, size, how well it’s fried. Here it’s spotted one that’s over-fried and says: pull it, drop a fresh one. That’s quality no busy line can watch by eye.”</w:t>
+              <w:t xml:space="preserve">“The red areas are where customers actually stop and spend time. Here, the brand wall pulls the most, the entrance the least. Now you can put your best products where people really go — not where you guessed.”</w:t>
             </w:r>
           </w:p>
         </w:tc>
@@ -1084,7 +958,7 @@
                 <w:sz w:val="20"/>
                 <w:szCs w:val="20"/>
               </w:rPr>
-              <w:t xml:space="preserve">Point to the two tenders and the batch score.</w:t>
+              <w:t xml:space="preserve">Point to the hottest area, then the coldest.</w:t>
             </w:r>
           </w:p>
         </w:tc>
@@ -1105,7 +979,7 @@
           <w:sz w:val="22"/>
           <w:szCs w:val="22"/>
         </w:rPr>
-        <w:t xml:space="preserve">4. Station 3 — was it built in the right order?</w:t>
+        <w:t xml:space="preserve">4. Spotting your best customer</w:t>
       </w:r>
       <w:r>
         <w:rPr>
@@ -1113,7 +987,7 @@
           <w:sz w:val="18"/>
           <w:szCs w:val="18"/>
         </w:rPr>
-        <w:t xml:space="preserve">	(0:45)</w:t>
+        <w:t xml:space="preserve">	(1:00)</w:t>
       </w:r>
     </w:p>
     <w:tbl>
@@ -1190,7 +1064,7 @@
                 <w:sz w:val="20"/>
                 <w:szCs w:val="20"/>
               </w:rPr>
-              <w:t xml:space="preserve">Station 3, the build shown as a strip of steps. A step is missing: “Add sauce to the order before bag.” The item is tagged “without sauce.”</w:t>
+              <w:t xml:space="preserve">A loyalty customer walks in; a message pops up on the phone with their name, level, and last visit.</w:t>
             </w:r>
           </w:p>
         </w:tc>
@@ -1253,7 +1127,7 @@
                 <w:sz w:val="21"/>
                 <w:szCs w:val="21"/>
               </w:rPr>
-              <w:t xml:space="preserve">“Station three watches how the food is built, step by step. This order was about to be bagged without its sauce — the system catches it and asks for it before the bag closes. When it’s right, it shows ‘SOP compliant.’”</w:t>
+              <w:t xml:space="preserve">“Watch the phone. A loyalty customer just walked in, and the manager’s phone shows who they are, their level, and what to offer. Now they get a warm welcome instead of walking past unnoticed.”</w:t>
             </w:r>
           </w:p>
         </w:tc>
@@ -1316,7 +1190,7 @@
                 <w:sz w:val="20"/>
                 <w:szCs w:val="20"/>
               </w:rPr>
-              <w:t xml:space="preserve">Point to the step strip, then the ‘add sauce’ flag.</w:t>
+              <w:t xml:space="preserve">When the message appears, point to the name and level. All of this is worked out inside the store.</w:t>
             </w:r>
           </w:p>
         </w:tc>
@@ -1337,7 +1211,7 @@
           <w:sz w:val="22"/>
           <w:szCs w:val="22"/>
         </w:rPr>
-        <w:t xml:space="preserve">5. Ops Board — every order, scored live</w:t>
+        <w:t xml:space="preserve">5. Small problems, caught early</w:t>
       </w:r>
       <w:r>
         <w:rPr>
@@ -1345,7 +1219,7 @@
           <w:sz w:val="18"/>
           <w:szCs w:val="18"/>
         </w:rPr>
-        <w:t xml:space="preserve">	(0:50)</w:t>
+        <w:t xml:space="preserve">	(0:45)</w:t>
       </w:r>
     </w:p>
     <w:tbl>
@@ -1422,7 +1296,7 @@
                 <w:sz w:val="20"/>
                 <w:szCs w:val="20"/>
               </w:rPr>
-              <w:t xml:space="preserve">Operations, Store #1234. A live list — every ticket, its channel (drive-thru, dine-in, mobile) and a score for order accuracy, quality, and prep. Along the top: throughput 41/hr, average order time 2m 47s, fryer oil 342°F, 14 open alerts.</w:t>
+              <w:t xml:space="preserve">Alerts appear — “section left unattended”, “queue building at till 2”, “too many staff in the back”.</w:t>
             </w:r>
           </w:p>
         </w:tc>
@@ -1485,7 +1359,7 @@
                 <w:sz w:val="21"/>
                 <w:szCs w:val="21"/>
               </w:rPr>
-              <w:t xml:space="preserve">“Everything rolls up here — every order, from every channel, scored as it happens. Green is clean, red needs a look. The manager sees the whole shift on one screen — even the fryer temperature and how long orders are taking.”</w:t>
+              <w:t xml:space="preserve">“The same cameras watch the floor for you. An empty section, a growing queue, too many staff in the back — the manager gets a quiet nudge while there’s still time to fix it.”</w:t>
             </w:r>
           </w:p>
         </w:tc>
@@ -1548,7 +1422,7 @@
                 <w:sz w:val="20"/>
                 <w:szCs w:val="20"/>
               </w:rPr>
-              <w:t xml:space="preserve">Run your finger down the ticket list; stop on a red ‘re-check’ row.</w:t>
+              <w:t xml:space="preserve">Read out one or two alerts as they appear.</w:t>
             </w:r>
           </w:p>
         </w:tc>
@@ -1569,7 +1443,7 @@
           <w:sz w:val="22"/>
           <w:szCs w:val="22"/>
         </w:rPr>
-        <w:t xml:space="preserve">6. The back of house, too</w:t>
+        <w:t xml:space="preserve">6. Quick recap</w:t>
       </w:r>
       <w:r>
         <w:rPr>
@@ -1577,7 +1451,7 @@
           <w:sz w:val="18"/>
           <w:szCs w:val="18"/>
         </w:rPr>
-        <w:t xml:space="preserve">	(0:40)</w:t>
+        <w:t xml:space="preserve">	(0:20)</w:t>
       </w:r>
     </w:p>
     <w:tbl>
@@ -1622,7 +1496,7 @@
                 <w:sz w:val="20"/>
                 <w:szCs w:val="20"/>
               </w:rPr>
-              <w:t xml:space="preserve">Show</w:t>
+              <w:t xml:space="preserve">Say</w:t>
             </w:r>
           </w:p>
         </w:tc>
@@ -1651,141 +1525,44 @@
                 <w:i w:val="false"/>
                 <w:iCs w:val="false"/>
                 <w:color w:val="000000"/>
-                <w:sz w:val="20"/>
-                <w:szCs w:val="20"/>
-              </w:rPr>
-              <w:t xml:space="preserve">Inventory — the storeroom shelves tracking stock (crinkle fries, tenders), the fryer, and the receiving door as deliveries arrive.</w:t>
-            </w:r>
-          </w:p>
-        </w:tc>
-      </w:tr>
-      <w:tr>
-        <w:tc>
-          <w:tcPr>
-            <w:tcW w:type="dxa" w:w="1000"/>
-            <w:tcBorders>
-              <w:top w:val="none" w:color="FFFFFF" w:sz="0"/>
-              <w:left w:val="none" w:color="FFFFFF" w:sz="0"/>
-              <w:bottom w:val="none" w:color="FFFFFF" w:sz="0"/>
-              <w:right w:val="none" w:color="FFFFFF" w:sz="0"/>
-            </w:tcBorders>
-            <w:tcMar>
-              <w:top w:type="dxa" w:w="30"/>
-              <w:left w:type="dxa" w:w="0"/>
-              <w:bottom w:type="dxa" w:w="30"/>
-              <w:right w:type="dxa" w:w="160"/>
-            </w:tcMar>
-          </w:tcPr>
-          <w:p>
-            <w:r>
-              <w:rPr>
-                <w:b/>
-                <w:bCs/>
-                <w:color w:val="000000"/>
-                <w:sz w:val="20"/>
-                <w:szCs w:val="20"/>
-              </w:rPr>
-              <w:t xml:space="preserve">Say</w:t>
-            </w:r>
-          </w:p>
-        </w:tc>
-        <w:tc>
-          <w:tcPr>
-            <w:tcW w:type="dxa" w:w="8360"/>
-            <w:tcBorders>
-              <w:top w:val="none" w:color="FFFFFF" w:sz="0"/>
-              <w:left w:val="none" w:color="FFFFFF" w:sz="0"/>
-              <w:bottom w:val="none" w:color="FFFFFF" w:sz="0"/>
-              <w:right w:val="none" w:color="FFFFFF" w:sz="0"/>
-            </w:tcBorders>
-            <w:tcMar>
-              <w:top w:type="dxa" w:w="30"/>
-              <w:left w:type="dxa" w:w="0"/>
-              <w:bottom w:type="dxa" w:w="30"/>
-              <w:right w:type="dxa" w:w="0"/>
-            </w:tcMar>
-          </w:tcPr>
-          <w:p>
-            <w:pPr>
-              <w:spacing w:line="264"/>
-            </w:pPr>
-            <w:r>
-              <w:rPr>
-                <w:i w:val="false"/>
-                <w:iCs w:val="false"/>
-                <w:color w:val="000000"/>
                 <w:sz w:val="21"/>
                 <w:szCs w:val="21"/>
               </w:rPr>
-              <w:t xml:space="preserve">“It’s not just the front line. The same system watches the storeroom and the back door — what’s on the shelf, what’s running low, and what’s just been delivered. One platform, front to back.”</w:t>
-            </w:r>
-          </w:p>
-        </w:tc>
-      </w:tr>
-      <w:tr>
-        <w:tc>
-          <w:tcPr>
-            <w:tcW w:type="dxa" w:w="1000"/>
-            <w:tcBorders>
-              <w:top w:val="none" w:color="FFFFFF" w:sz="0"/>
-              <w:left w:val="none" w:color="FFFFFF" w:sz="0"/>
-              <w:bottom w:val="none" w:color="FFFFFF" w:sz="0"/>
-              <w:right w:val="none" w:color="FFFFFF" w:sz="0"/>
-            </w:tcBorders>
-            <w:tcMar>
-              <w:top w:type="dxa" w:w="30"/>
-              <w:left w:type="dxa" w:w="0"/>
-              <w:bottom w:type="dxa" w:w="30"/>
-              <w:right w:type="dxa" w:w="160"/>
-            </w:tcMar>
-          </w:tcPr>
-          <w:p>
-            <w:r>
-              <w:rPr>
-                <w:b/>
-                <w:bCs/>
-                <w:color w:val="000000"/>
-                <w:sz w:val="20"/>
-                <w:szCs w:val="20"/>
-              </w:rPr>
-              <w:t xml:space="preserve">Point</w:t>
-            </w:r>
-          </w:p>
-        </w:tc>
-        <w:tc>
-          <w:tcPr>
-            <w:tcW w:type="dxa" w:w="8360"/>
-            <w:tcBorders>
-              <w:top w:val="none" w:color="FFFFFF" w:sz="0"/>
-              <w:left w:val="none" w:color="FFFFFF" w:sz="0"/>
-              <w:bottom w:val="none" w:color="FFFFFF" w:sz="0"/>
-              <w:right w:val="none" w:color="FFFFFF" w:sz="0"/>
-            </w:tcBorders>
-            <w:tcMar>
-              <w:top w:type="dxa" w:w="30"/>
-              <w:left w:type="dxa" w:w="0"/>
-              <w:bottom w:type="dxa" w:w="30"/>
-              <w:right w:type="dxa" w:w="0"/>
-            </w:tcMar>
-          </w:tcPr>
-          <w:p>
-            <w:pPr>
-              <w:spacing w:line="264"/>
-            </w:pPr>
-            <w:r>
-              <w:rPr>
-                <w:i/>
-                <w:iCs/>
-                <w:color w:val="000000"/>
-                <w:sz w:val="20"/>
-                <w:szCs w:val="20"/>
-              </w:rPr>
-              <w:t xml:space="preserve">Point to a tracked box on the shelf, then the receiving-door camera.</w:t>
+              <w:t xml:space="preserve">“Same cameras, two jobs — help the customer, and help your team. It all runs on one small box inside the store, and nothing leaves the building.”</w:t>
             </w:r>
           </w:p>
         </w:tc>
       </w:tr>
     </w:tbl>
+    <w:p>
+      <w:pPr>
+        <w:pBdr>
+          <w:bottom w:val="single" w:color="000000" w:sz="8" w:space="4"/>
+        </w:pBdr>
+        <w:tabs>
+          <w:tab w:val="right" w:pos="9360"/>
+        </w:tabs>
+        <w:spacing w:after="120" w:before="320"/>
+      </w:pPr>
+      <w:r>
+        <w:rPr>
+          <w:b/>
+          <w:bCs/>
+          <w:color w:val="000000"/>
+          <w:sz w:val="24"/>
+          <w:szCs w:val="24"/>
+        </w:rPr>
+        <w:t xml:space="preserve">Part B · Fabric Lens — the restaurant line</w:t>
+      </w:r>
+      <w:r>
+        <w:rPr>
+          <w:color w:val="444444"/>
+          <w:sz w:val="18"/>
+          <w:szCs w:val="18"/>
+        </w:rPr>
+        <w:t xml:space="preserve">	about 5:25</w:t>
+      </w:r>
+    </w:p>
     <w:p>
       <w:pPr>
         <w:tabs>
@@ -1801,7 +1578,7 @@
           <w:sz w:val="22"/>
           <w:szCs w:val="22"/>
         </w:rPr>
-        <w:t xml:space="preserve">7. The numbers that add up</w:t>
+        <w:t xml:space="preserve">1. The whole restaurant on one screen</w:t>
       </w:r>
       <w:r>
         <w:rPr>
@@ -1809,7 +1586,7 @@
           <w:sz w:val="18"/>
           <w:szCs w:val="18"/>
         </w:rPr>
-        <w:t xml:space="preserve">	(0:35)</w:t>
+        <w:t xml:space="preserve">	(0:30)</w:t>
       </w:r>
     </w:p>
     <w:tbl>
@@ -1886,7 +1663,7 @@
                 <w:sz w:val="20"/>
                 <w:szCs w:val="20"/>
               </w:rPr>
-              <w:t xml:space="preserve">Insights and Alerts — the shift’s key numbers (accuracy, speed, food safety, waste) and a live list of what needs attention.</w:t>
+              <w:t xml:space="preserve">The Live Wall — every camera at once: the make-line stations, the fryer, the storeroom shelves, and the back door.</w:t>
             </w:r>
           </w:p>
         </w:tc>
@@ -1949,7 +1726,7 @@
                 <w:sz w:val="21"/>
                 <w:szCs w:val="21"/>
               </w:rPr>
-              <w:t xml:space="preserve">“And it adds up to the numbers a manager and an owner actually use — accuracy, speed, food safety, waste — with a live list of what needs a look. Ready for the next audit, with nobody filling in a clipboard.”</w:t>
+              <w:t xml:space="preserve">“This is the whole restaurant on one screen — the front line, the fryer, the storeroom, even the delivery door. One system watches all of it, live. Everything I show next is happening on these same cameras.”</w:t>
             </w:r>
           </w:p>
         </w:tc>
@@ -2012,7 +1789,7 @@
                 <w:sz w:val="20"/>
                 <w:szCs w:val="20"/>
               </w:rPr>
-              <w:t xml:space="preserve">Point to one number, then the alert list.</w:t>
+              <w:t xml:space="preserve">Point out a make-line station, the fryer, and the storeroom shelves.</w:t>
             </w:r>
           </w:p>
         </w:tc>
@@ -2033,7 +1810,7 @@
           <w:sz w:val="22"/>
           <w:szCs w:val="22"/>
         </w:rPr>
-        <w:t xml:space="preserve">8. Recap</w:t>
+        <w:t xml:space="preserve">2. Station 1 — is the order right?</w:t>
       </w:r>
       <w:r>
         <w:rPr>
@@ -2041,7 +1818,7 @@
           <w:sz w:val="18"/>
           <w:szCs w:val="18"/>
         </w:rPr>
-        <w:t xml:space="preserve">	(0:20)</w:t>
+        <w:t xml:space="preserve">	(1:00)</w:t>
       </w:r>
     </w:p>
     <w:tbl>
@@ -2086,7 +1863,7 @@
                 <w:sz w:val="20"/>
                 <w:szCs w:val="20"/>
               </w:rPr>
-              <w:t xml:space="preserve">Say</w:t>
+              <w:t xml:space="preserve">Show</w:t>
             </w:r>
           </w:p>
         </w:tc>
@@ -2115,6 +1892,1524 @@
                 <w:i w:val="false"/>
                 <w:iCs w:val="false"/>
                 <w:color w:val="000000"/>
+                <w:sz w:val="20"/>
+                <w:szCs w:val="20"/>
+              </w:rPr>
+              <w:t xml:space="preserve">Station 1, looking down at the box. It reads the ticket (a Box Combo) and checks every item. A red line appears: “Drop a slice of Texas toast in the box.”</w:t>
+            </w:r>
+          </w:p>
+        </w:tc>
+      </w:tr>
+      <w:tr>
+        <w:tc>
+          <w:tcPr>
+            <w:tcW w:type="dxa" w:w="1000"/>
+            <w:tcBorders>
+              <w:top w:val="none" w:color="FFFFFF" w:sz="0"/>
+              <w:left w:val="none" w:color="FFFFFF" w:sz="0"/>
+              <w:bottom w:val="none" w:color="FFFFFF" w:sz="0"/>
+              <w:right w:val="none" w:color="FFFFFF" w:sz="0"/>
+            </w:tcBorders>
+            <w:tcMar>
+              <w:top w:type="dxa" w:w="30"/>
+              <w:left w:type="dxa" w:w="0"/>
+              <w:bottom w:type="dxa" w:w="30"/>
+              <w:right w:type="dxa" w:w="160"/>
+            </w:tcMar>
+          </w:tcPr>
+          <w:p>
+            <w:r>
+              <w:rPr>
+                <w:b/>
+                <w:bCs/>
+                <w:color w:val="000000"/>
+                <w:sz w:val="20"/>
+                <w:szCs w:val="20"/>
+              </w:rPr>
+              <w:t xml:space="preserve">Say</w:t>
+            </w:r>
+          </w:p>
+        </w:tc>
+        <w:tc>
+          <w:tcPr>
+            <w:tcW w:type="dxa" w:w="8360"/>
+            <w:tcBorders>
+              <w:top w:val="none" w:color="FFFFFF" w:sz="0"/>
+              <w:left w:val="none" w:color="FFFFFF" w:sz="0"/>
+              <w:bottom w:val="none" w:color="FFFFFF" w:sz="0"/>
+              <w:right w:val="none" w:color="FFFFFF" w:sz="0"/>
+            </w:tcBorders>
+            <w:tcMar>
+              <w:top w:type="dxa" w:w="30"/>
+              <w:left w:type="dxa" w:w="0"/>
+              <w:bottom w:type="dxa" w:w="30"/>
+              <w:right w:type="dxa" w:w="0"/>
+            </w:tcMar>
+          </w:tcPr>
+          <w:p>
+            <w:pPr>
+              <w:spacing w:line="264"/>
+            </w:pPr>
+            <w:r>
+              <w:rPr>
+                <w:i w:val="false"/>
+                <w:iCs w:val="false"/>
+                <w:color w:val="000000"/>
+                <w:sz w:val="21"/>
+                <w:szCs w:val="21"/>
+              </w:rPr>
+              <w:t xml:space="preserve">“Station one checks the order before it’s bagged. The camera reads the ticket and counts what’s actually in the box — and it’s caught a missing Texas toast. The screen tells the team exactly what to add.”</w:t>
+            </w:r>
+          </w:p>
+        </w:tc>
+      </w:tr>
+      <w:tr>
+        <w:tc>
+          <w:tcPr>
+            <w:tcW w:type="dxa" w:w="1000"/>
+            <w:tcBorders>
+              <w:top w:val="none" w:color="FFFFFF" w:sz="0"/>
+              <w:left w:val="none" w:color="FFFFFF" w:sz="0"/>
+              <w:bottom w:val="none" w:color="FFFFFF" w:sz="0"/>
+              <w:right w:val="none" w:color="FFFFFF" w:sz="0"/>
+            </w:tcBorders>
+            <w:tcMar>
+              <w:top w:type="dxa" w:w="30"/>
+              <w:left w:type="dxa" w:w="0"/>
+              <w:bottom w:type="dxa" w:w="30"/>
+              <w:right w:type="dxa" w:w="160"/>
+            </w:tcMar>
+          </w:tcPr>
+          <w:p>
+            <w:r>
+              <w:rPr>
+                <w:b/>
+                <w:bCs/>
+                <w:color w:val="000000"/>
+                <w:sz w:val="20"/>
+                <w:szCs w:val="20"/>
+              </w:rPr>
+              <w:t xml:space="preserve">Point</w:t>
+            </w:r>
+          </w:p>
+        </w:tc>
+        <w:tc>
+          <w:tcPr>
+            <w:tcW w:type="dxa" w:w="8360"/>
+            <w:tcBorders>
+              <w:top w:val="none" w:color="FFFFFF" w:sz="0"/>
+              <w:left w:val="none" w:color="FFFFFF" w:sz="0"/>
+              <w:bottom w:val="none" w:color="FFFFFF" w:sz="0"/>
+              <w:right w:val="none" w:color="FFFFFF" w:sz="0"/>
+            </w:tcBorders>
+            <w:tcMar>
+              <w:top w:type="dxa" w:w="30"/>
+              <w:left w:type="dxa" w:w="0"/>
+              <w:bottom w:type="dxa" w:w="30"/>
+              <w:right w:type="dxa" w:w="0"/>
+            </w:tcMar>
+          </w:tcPr>
+          <w:p>
+            <w:pPr>
+              <w:spacing w:line="264"/>
+            </w:pPr>
+            <w:r>
+              <w:rPr>
+                <w:i/>
+                <w:iCs/>
+                <w:color w:val="000000"/>
+                <w:sz w:val="20"/>
+                <w:szCs w:val="20"/>
+              </w:rPr>
+              <w:t xml:space="preserve">Point to the alert line, then to the ticket checklist on the right.</w:t>
+            </w:r>
+          </w:p>
+        </w:tc>
+      </w:tr>
+      <w:tr>
+        <w:tc>
+          <w:tcPr>
+            <w:tcW w:type="dxa" w:w="1000"/>
+            <w:tcBorders>
+              <w:top w:val="none" w:color="FFFFFF" w:sz="0"/>
+              <w:left w:val="none" w:color="FFFFFF" w:sz="0"/>
+              <w:bottom w:val="none" w:color="FFFFFF" w:sz="0"/>
+              <w:right w:val="none" w:color="FFFFFF" w:sz="0"/>
+            </w:tcBorders>
+            <w:tcMar>
+              <w:top w:type="dxa" w:w="30"/>
+              <w:left w:type="dxa" w:w="0"/>
+              <w:bottom w:type="dxa" w:w="30"/>
+              <w:right w:type="dxa" w:w="160"/>
+            </w:tcMar>
+          </w:tcPr>
+          <w:p>
+            <w:r>
+              <w:rPr>
+                <w:b/>
+                <w:bCs/>
+                <w:color w:val="000000"/>
+                <w:sz w:val="20"/>
+                <w:szCs w:val="20"/>
+              </w:rPr>
+              <w:t xml:space="preserve">Show</w:t>
+            </w:r>
+          </w:p>
+        </w:tc>
+        <w:tc>
+          <w:tcPr>
+            <w:tcW w:type="dxa" w:w="8360"/>
+            <w:tcBorders>
+              <w:top w:val="none" w:color="FFFFFF" w:sz="0"/>
+              <w:left w:val="none" w:color="FFFFFF" w:sz="0"/>
+              <w:bottom w:val="none" w:color="FFFFFF" w:sz="0"/>
+              <w:right w:val="none" w:color="FFFFFF" w:sz="0"/>
+            </w:tcBorders>
+            <w:tcMar>
+              <w:top w:type="dxa" w:w="30"/>
+              <w:left w:type="dxa" w:w="0"/>
+              <w:bottom w:type="dxa" w:w="30"/>
+              <w:right w:type="dxa" w:w="0"/>
+            </w:tcMar>
+          </w:tcPr>
+          <w:p>
+            <w:pPr>
+              <w:spacing w:line="264"/>
+            </w:pPr>
+            <w:r>
+              <w:rPr>
+                <w:i w:val="false"/>
+                <w:iCs w:val="false"/>
+                <w:color w:val="000000"/>
+                <w:sz w:val="20"/>
+                <w:szCs w:val="20"/>
+              </w:rPr>
+              <w:t xml:space="preserve">The toast goes in; the team taps Re-check; the panel turns green — “Order complete · Ready, bag it.”</w:t>
+            </w:r>
+          </w:p>
+        </w:tc>
+      </w:tr>
+      <w:tr>
+        <w:tc>
+          <w:tcPr>
+            <w:tcW w:type="dxa" w:w="1000"/>
+            <w:tcBorders>
+              <w:top w:val="none" w:color="FFFFFF" w:sz="0"/>
+              <w:left w:val="none" w:color="FFFFFF" w:sz="0"/>
+              <w:bottom w:val="none" w:color="FFFFFF" w:sz="0"/>
+              <w:right w:val="none" w:color="FFFFFF" w:sz="0"/>
+            </w:tcBorders>
+            <w:tcMar>
+              <w:top w:type="dxa" w:w="30"/>
+              <w:left w:type="dxa" w:w="0"/>
+              <w:bottom w:type="dxa" w:w="30"/>
+              <w:right w:type="dxa" w:w="160"/>
+            </w:tcMar>
+          </w:tcPr>
+          <w:p>
+            <w:r>
+              <w:rPr>
+                <w:b/>
+                <w:bCs/>
+                <w:color w:val="000000"/>
+                <w:sz w:val="20"/>
+                <w:szCs w:val="20"/>
+              </w:rPr>
+              <w:t xml:space="preserve">Say</w:t>
+            </w:r>
+          </w:p>
+        </w:tc>
+        <w:tc>
+          <w:tcPr>
+            <w:tcW w:type="dxa" w:w="8360"/>
+            <w:tcBorders>
+              <w:top w:val="none" w:color="FFFFFF" w:sz="0"/>
+              <w:left w:val="none" w:color="FFFFFF" w:sz="0"/>
+              <w:bottom w:val="none" w:color="FFFFFF" w:sz="0"/>
+              <w:right w:val="none" w:color="FFFFFF" w:sz="0"/>
+            </w:tcBorders>
+            <w:tcMar>
+              <w:top w:type="dxa" w:w="30"/>
+              <w:left w:type="dxa" w:w="0"/>
+              <w:bottom w:type="dxa" w:w="30"/>
+              <w:right w:type="dxa" w:w="0"/>
+            </w:tcMar>
+          </w:tcPr>
+          <w:p>
+            <w:pPr>
+              <w:spacing w:line="264"/>
+            </w:pPr>
+            <w:r>
+              <w:rPr>
+                <w:i w:val="false"/>
+                <w:iCs w:val="false"/>
+                <w:color w:val="000000"/>
+                <w:sz w:val="21"/>
+                <w:szCs w:val="21"/>
+              </w:rPr>
+              <w:t xml:space="preserve">“They add it, re-check, and it clears to green. A wrong order fixed before it ever left the counter.”</w:t>
+            </w:r>
+          </w:p>
+        </w:tc>
+      </w:tr>
+    </w:tbl>
+    <w:p>
+      <w:pPr>
+        <w:tabs>
+          <w:tab w:val="right" w:pos="9360"/>
+        </w:tabs>
+        <w:spacing w:after="40" w:before="220"/>
+      </w:pPr>
+      <w:r>
+        <w:rPr>
+          <w:b/>
+          <w:bCs/>
+          <w:color w:val="000000"/>
+          <w:sz w:val="22"/>
+          <w:szCs w:val="22"/>
+        </w:rPr>
+        <w:t xml:space="preserve">3. Station 2 — is it cooked right?</w:t>
+      </w:r>
+      <w:r>
+        <w:rPr>
+          <w:color w:val="444444"/>
+          <w:sz w:val="18"/>
+          <w:szCs w:val="18"/>
+        </w:rPr>
+        <w:t xml:space="preserve">	(0:45)</w:t>
+      </w:r>
+    </w:p>
+    <w:tbl>
+      <w:tblPr>
+        <w:tblW w:type="dxa" w:w="9360"/>
+        <w:tblBorders>
+          <w:top w:val="none" w:color="FFFFFF" w:sz="0"/>
+          <w:left w:val="none" w:color="FFFFFF" w:sz="0"/>
+          <w:bottom w:val="none" w:color="FFFFFF" w:sz="0"/>
+          <w:right w:val="none" w:color="FFFFFF" w:sz="0"/>
+          <w:insideH w:val="none" w:color="FFFFFF" w:sz="0"/>
+          <w:insideV w:val="none" w:color="FFFFFF" w:sz="0"/>
+        </w:tblBorders>
+      </w:tblPr>
+      <w:tblGrid>
+        <w:gridCol w:w="1000"/>
+        <w:gridCol w:w="8360"/>
+      </w:tblGrid>
+      <w:tr>
+        <w:tc>
+          <w:tcPr>
+            <w:tcW w:type="dxa" w:w="1000"/>
+            <w:tcBorders>
+              <w:top w:val="none" w:color="FFFFFF" w:sz="0"/>
+              <w:left w:val="none" w:color="FFFFFF" w:sz="0"/>
+              <w:bottom w:val="none" w:color="FFFFFF" w:sz="0"/>
+              <w:right w:val="none" w:color="FFFFFF" w:sz="0"/>
+            </w:tcBorders>
+            <w:tcMar>
+              <w:top w:type="dxa" w:w="30"/>
+              <w:left w:type="dxa" w:w="0"/>
+              <w:bottom w:type="dxa" w:w="30"/>
+              <w:right w:type="dxa" w:w="160"/>
+            </w:tcMar>
+          </w:tcPr>
+          <w:p>
+            <w:r>
+              <w:rPr>
+                <w:b/>
+                <w:bCs/>
+                <w:color w:val="000000"/>
+                <w:sz w:val="20"/>
+                <w:szCs w:val="20"/>
+              </w:rPr>
+              <w:t xml:space="preserve">Show</w:t>
+            </w:r>
+          </w:p>
+        </w:tc>
+        <w:tc>
+          <w:tcPr>
+            <w:tcW w:type="dxa" w:w="8360"/>
+            <w:tcBorders>
+              <w:top w:val="none" w:color="FFFFFF" w:sz="0"/>
+              <w:left w:val="none" w:color="FFFFFF" w:sz="0"/>
+              <w:bottom w:val="none" w:color="FFFFFF" w:sz="0"/>
+              <w:right w:val="none" w:color="FFFFFF" w:sz="0"/>
+            </w:tcBorders>
+            <w:tcMar>
+              <w:top w:type="dxa" w:w="30"/>
+              <w:left w:type="dxa" w:w="0"/>
+              <w:bottom w:type="dxa" w:w="30"/>
+              <w:right w:type="dxa" w:w="0"/>
+            </w:tcMar>
+          </w:tcPr>
+          <w:p>
+            <w:pPr>
+              <w:spacing w:line="264"/>
+            </w:pPr>
+            <w:r>
+              <w:rPr>
+                <w:i w:val="false"/>
+                <w:iCs w:val="false"/>
+                <w:color w:val="000000"/>
+                <w:sz w:val="20"/>
+                <w:szCs w:val="20"/>
+              </w:rPr>
+              <w:t xml:space="preserve">Station 2, two cooked tenders side by side, graded against the ideal. Batch score 95%. One is flagged: “Pull the over-fried tender, drop a fresh one.”</w:t>
+            </w:r>
+          </w:p>
+        </w:tc>
+      </w:tr>
+      <w:tr>
+        <w:tc>
+          <w:tcPr>
+            <w:tcW w:type="dxa" w:w="1000"/>
+            <w:tcBorders>
+              <w:top w:val="none" w:color="FFFFFF" w:sz="0"/>
+              <w:left w:val="none" w:color="FFFFFF" w:sz="0"/>
+              <w:bottom w:val="none" w:color="FFFFFF" w:sz="0"/>
+              <w:right w:val="none" w:color="FFFFFF" w:sz="0"/>
+            </w:tcBorders>
+            <w:tcMar>
+              <w:top w:type="dxa" w:w="30"/>
+              <w:left w:type="dxa" w:w="0"/>
+              <w:bottom w:type="dxa" w:w="30"/>
+              <w:right w:type="dxa" w:w="160"/>
+            </w:tcMar>
+          </w:tcPr>
+          <w:p>
+            <w:r>
+              <w:rPr>
+                <w:b/>
+                <w:bCs/>
+                <w:color w:val="000000"/>
+                <w:sz w:val="20"/>
+                <w:szCs w:val="20"/>
+              </w:rPr>
+              <w:t xml:space="preserve">Say</w:t>
+            </w:r>
+          </w:p>
+        </w:tc>
+        <w:tc>
+          <w:tcPr>
+            <w:tcW w:type="dxa" w:w="8360"/>
+            <w:tcBorders>
+              <w:top w:val="none" w:color="FFFFFF" w:sz="0"/>
+              <w:left w:val="none" w:color="FFFFFF" w:sz="0"/>
+              <w:bottom w:val="none" w:color="FFFFFF" w:sz="0"/>
+              <w:right w:val="none" w:color="FFFFFF" w:sz="0"/>
+            </w:tcBorders>
+            <w:tcMar>
+              <w:top w:type="dxa" w:w="30"/>
+              <w:left w:type="dxa" w:w="0"/>
+              <w:bottom w:type="dxa" w:w="30"/>
+              <w:right w:type="dxa" w:w="0"/>
+            </w:tcMar>
+          </w:tcPr>
+          <w:p>
+            <w:pPr>
+              <w:spacing w:line="264"/>
+            </w:pPr>
+            <w:r>
+              <w:rPr>
+                <w:i w:val="false"/>
+                <w:iCs w:val="false"/>
+                <w:color w:val="000000"/>
+                <w:sz w:val="21"/>
+                <w:szCs w:val="21"/>
+              </w:rPr>
+              <w:t xml:space="preserve">“Station two grades how the food is cooked. It compares each piece to the ideal — colour, size, how well it’s fried. Here it’s spotted one that’s over-fried and says: pull it, drop a fresh one. That’s quality no busy line can watch by eye.”</w:t>
+            </w:r>
+          </w:p>
+        </w:tc>
+      </w:tr>
+      <w:tr>
+        <w:tc>
+          <w:tcPr>
+            <w:tcW w:type="dxa" w:w="1000"/>
+            <w:tcBorders>
+              <w:top w:val="none" w:color="FFFFFF" w:sz="0"/>
+              <w:left w:val="none" w:color="FFFFFF" w:sz="0"/>
+              <w:bottom w:val="none" w:color="FFFFFF" w:sz="0"/>
+              <w:right w:val="none" w:color="FFFFFF" w:sz="0"/>
+            </w:tcBorders>
+            <w:tcMar>
+              <w:top w:type="dxa" w:w="30"/>
+              <w:left w:type="dxa" w:w="0"/>
+              <w:bottom w:type="dxa" w:w="30"/>
+              <w:right w:type="dxa" w:w="160"/>
+            </w:tcMar>
+          </w:tcPr>
+          <w:p>
+            <w:r>
+              <w:rPr>
+                <w:b/>
+                <w:bCs/>
+                <w:color w:val="000000"/>
+                <w:sz w:val="20"/>
+                <w:szCs w:val="20"/>
+              </w:rPr>
+              <w:t xml:space="preserve">Point</w:t>
+            </w:r>
+          </w:p>
+        </w:tc>
+        <w:tc>
+          <w:tcPr>
+            <w:tcW w:type="dxa" w:w="8360"/>
+            <w:tcBorders>
+              <w:top w:val="none" w:color="FFFFFF" w:sz="0"/>
+              <w:left w:val="none" w:color="FFFFFF" w:sz="0"/>
+              <w:bottom w:val="none" w:color="FFFFFF" w:sz="0"/>
+              <w:right w:val="none" w:color="FFFFFF" w:sz="0"/>
+            </w:tcBorders>
+            <w:tcMar>
+              <w:top w:type="dxa" w:w="30"/>
+              <w:left w:type="dxa" w:w="0"/>
+              <w:bottom w:type="dxa" w:w="30"/>
+              <w:right w:type="dxa" w:w="0"/>
+            </w:tcMar>
+          </w:tcPr>
+          <w:p>
+            <w:pPr>
+              <w:spacing w:line="264"/>
+            </w:pPr>
+            <w:r>
+              <w:rPr>
+                <w:i/>
+                <w:iCs/>
+                <w:color w:val="000000"/>
+                <w:sz w:val="20"/>
+                <w:szCs w:val="20"/>
+              </w:rPr>
+              <w:t xml:space="preserve">Point to the two tenders and the batch score.</w:t>
+            </w:r>
+          </w:p>
+        </w:tc>
+      </w:tr>
+    </w:tbl>
+    <w:p>
+      <w:pPr>
+        <w:tabs>
+          <w:tab w:val="right" w:pos="9360"/>
+        </w:tabs>
+        <w:spacing w:after="40" w:before="220"/>
+      </w:pPr>
+      <w:r>
+        <w:rPr>
+          <w:b/>
+          <w:bCs/>
+          <w:color w:val="000000"/>
+          <w:sz w:val="22"/>
+          <w:szCs w:val="22"/>
+        </w:rPr>
+        <w:t xml:space="preserve">4. Station 3 — was it built in the right order?</w:t>
+      </w:r>
+      <w:r>
+        <w:rPr>
+          <w:color w:val="444444"/>
+          <w:sz w:val="18"/>
+          <w:szCs w:val="18"/>
+        </w:rPr>
+        <w:t xml:space="preserve">	(0:45)</w:t>
+      </w:r>
+    </w:p>
+    <w:tbl>
+      <w:tblPr>
+        <w:tblW w:type="dxa" w:w="9360"/>
+        <w:tblBorders>
+          <w:top w:val="none" w:color="FFFFFF" w:sz="0"/>
+          <w:left w:val="none" w:color="FFFFFF" w:sz="0"/>
+          <w:bottom w:val="none" w:color="FFFFFF" w:sz="0"/>
+          <w:right w:val="none" w:color="FFFFFF" w:sz="0"/>
+          <w:insideH w:val="none" w:color="FFFFFF" w:sz="0"/>
+          <w:insideV w:val="none" w:color="FFFFFF" w:sz="0"/>
+        </w:tblBorders>
+      </w:tblPr>
+      <w:tblGrid>
+        <w:gridCol w:w="1000"/>
+        <w:gridCol w:w="8360"/>
+      </w:tblGrid>
+      <w:tr>
+        <w:tc>
+          <w:tcPr>
+            <w:tcW w:type="dxa" w:w="1000"/>
+            <w:tcBorders>
+              <w:top w:val="none" w:color="FFFFFF" w:sz="0"/>
+              <w:left w:val="none" w:color="FFFFFF" w:sz="0"/>
+              <w:bottom w:val="none" w:color="FFFFFF" w:sz="0"/>
+              <w:right w:val="none" w:color="FFFFFF" w:sz="0"/>
+            </w:tcBorders>
+            <w:tcMar>
+              <w:top w:type="dxa" w:w="30"/>
+              <w:left w:type="dxa" w:w="0"/>
+              <w:bottom w:type="dxa" w:w="30"/>
+              <w:right w:type="dxa" w:w="160"/>
+            </w:tcMar>
+          </w:tcPr>
+          <w:p>
+            <w:r>
+              <w:rPr>
+                <w:b/>
+                <w:bCs/>
+                <w:color w:val="000000"/>
+                <w:sz w:val="20"/>
+                <w:szCs w:val="20"/>
+              </w:rPr>
+              <w:t xml:space="preserve">Show</w:t>
+            </w:r>
+          </w:p>
+        </w:tc>
+        <w:tc>
+          <w:tcPr>
+            <w:tcW w:type="dxa" w:w="8360"/>
+            <w:tcBorders>
+              <w:top w:val="none" w:color="FFFFFF" w:sz="0"/>
+              <w:left w:val="none" w:color="FFFFFF" w:sz="0"/>
+              <w:bottom w:val="none" w:color="FFFFFF" w:sz="0"/>
+              <w:right w:val="none" w:color="FFFFFF" w:sz="0"/>
+            </w:tcBorders>
+            <w:tcMar>
+              <w:top w:type="dxa" w:w="30"/>
+              <w:left w:type="dxa" w:w="0"/>
+              <w:bottom w:type="dxa" w:w="30"/>
+              <w:right w:type="dxa" w:w="0"/>
+            </w:tcMar>
+          </w:tcPr>
+          <w:p>
+            <w:pPr>
+              <w:spacing w:line="264"/>
+            </w:pPr>
+            <w:r>
+              <w:rPr>
+                <w:i w:val="false"/>
+                <w:iCs w:val="false"/>
+                <w:color w:val="000000"/>
+                <w:sz w:val="20"/>
+                <w:szCs w:val="20"/>
+              </w:rPr>
+              <w:t xml:space="preserve">Station 3, the build shown as a strip of steps. A step is missing: “Add sauce to the order before bag.” The item is tagged “without sauce.”</w:t>
+            </w:r>
+          </w:p>
+        </w:tc>
+      </w:tr>
+      <w:tr>
+        <w:tc>
+          <w:tcPr>
+            <w:tcW w:type="dxa" w:w="1000"/>
+            <w:tcBorders>
+              <w:top w:val="none" w:color="FFFFFF" w:sz="0"/>
+              <w:left w:val="none" w:color="FFFFFF" w:sz="0"/>
+              <w:bottom w:val="none" w:color="FFFFFF" w:sz="0"/>
+              <w:right w:val="none" w:color="FFFFFF" w:sz="0"/>
+            </w:tcBorders>
+            <w:tcMar>
+              <w:top w:type="dxa" w:w="30"/>
+              <w:left w:type="dxa" w:w="0"/>
+              <w:bottom w:type="dxa" w:w="30"/>
+              <w:right w:type="dxa" w:w="160"/>
+            </w:tcMar>
+          </w:tcPr>
+          <w:p>
+            <w:r>
+              <w:rPr>
+                <w:b/>
+                <w:bCs/>
+                <w:color w:val="000000"/>
+                <w:sz w:val="20"/>
+                <w:szCs w:val="20"/>
+              </w:rPr>
+              <w:t xml:space="preserve">Say</w:t>
+            </w:r>
+          </w:p>
+        </w:tc>
+        <w:tc>
+          <w:tcPr>
+            <w:tcW w:type="dxa" w:w="8360"/>
+            <w:tcBorders>
+              <w:top w:val="none" w:color="FFFFFF" w:sz="0"/>
+              <w:left w:val="none" w:color="FFFFFF" w:sz="0"/>
+              <w:bottom w:val="none" w:color="FFFFFF" w:sz="0"/>
+              <w:right w:val="none" w:color="FFFFFF" w:sz="0"/>
+            </w:tcBorders>
+            <w:tcMar>
+              <w:top w:type="dxa" w:w="30"/>
+              <w:left w:type="dxa" w:w="0"/>
+              <w:bottom w:type="dxa" w:w="30"/>
+              <w:right w:type="dxa" w:w="0"/>
+            </w:tcMar>
+          </w:tcPr>
+          <w:p>
+            <w:pPr>
+              <w:spacing w:line="264"/>
+            </w:pPr>
+            <w:r>
+              <w:rPr>
+                <w:i w:val="false"/>
+                <w:iCs w:val="false"/>
+                <w:color w:val="000000"/>
+                <w:sz w:val="21"/>
+                <w:szCs w:val="21"/>
+              </w:rPr>
+              <w:t xml:space="preserve">“Station three watches how the food is built, step by step. This order was about to be bagged without its sauce — the system catches it and asks for it before the bag closes. When it’s right, it shows ‘SOP compliant.’”</w:t>
+            </w:r>
+          </w:p>
+        </w:tc>
+      </w:tr>
+      <w:tr>
+        <w:tc>
+          <w:tcPr>
+            <w:tcW w:type="dxa" w:w="1000"/>
+            <w:tcBorders>
+              <w:top w:val="none" w:color="FFFFFF" w:sz="0"/>
+              <w:left w:val="none" w:color="FFFFFF" w:sz="0"/>
+              <w:bottom w:val="none" w:color="FFFFFF" w:sz="0"/>
+              <w:right w:val="none" w:color="FFFFFF" w:sz="0"/>
+            </w:tcBorders>
+            <w:tcMar>
+              <w:top w:type="dxa" w:w="30"/>
+              <w:left w:type="dxa" w:w="0"/>
+              <w:bottom w:type="dxa" w:w="30"/>
+              <w:right w:type="dxa" w:w="160"/>
+            </w:tcMar>
+          </w:tcPr>
+          <w:p>
+            <w:r>
+              <w:rPr>
+                <w:b/>
+                <w:bCs/>
+                <w:color w:val="000000"/>
+                <w:sz w:val="20"/>
+                <w:szCs w:val="20"/>
+              </w:rPr>
+              <w:t xml:space="preserve">Point</w:t>
+            </w:r>
+          </w:p>
+        </w:tc>
+        <w:tc>
+          <w:tcPr>
+            <w:tcW w:type="dxa" w:w="8360"/>
+            <w:tcBorders>
+              <w:top w:val="none" w:color="FFFFFF" w:sz="0"/>
+              <w:left w:val="none" w:color="FFFFFF" w:sz="0"/>
+              <w:bottom w:val="none" w:color="FFFFFF" w:sz="0"/>
+              <w:right w:val="none" w:color="FFFFFF" w:sz="0"/>
+            </w:tcBorders>
+            <w:tcMar>
+              <w:top w:type="dxa" w:w="30"/>
+              <w:left w:type="dxa" w:w="0"/>
+              <w:bottom w:type="dxa" w:w="30"/>
+              <w:right w:type="dxa" w:w="0"/>
+            </w:tcMar>
+          </w:tcPr>
+          <w:p>
+            <w:pPr>
+              <w:spacing w:line="264"/>
+            </w:pPr>
+            <w:r>
+              <w:rPr>
+                <w:i/>
+                <w:iCs/>
+                <w:color w:val="000000"/>
+                <w:sz w:val="20"/>
+                <w:szCs w:val="20"/>
+              </w:rPr>
+              <w:t xml:space="preserve">Point to the step strip, then the ‘add sauce’ flag.</w:t>
+            </w:r>
+          </w:p>
+        </w:tc>
+      </w:tr>
+    </w:tbl>
+    <w:p>
+      <w:pPr>
+        <w:tabs>
+          <w:tab w:val="right" w:pos="9360"/>
+        </w:tabs>
+        <w:spacing w:after="40" w:before="220"/>
+      </w:pPr>
+      <w:r>
+        <w:rPr>
+          <w:b/>
+          <w:bCs/>
+          <w:color w:val="000000"/>
+          <w:sz w:val="22"/>
+          <w:szCs w:val="22"/>
+        </w:rPr>
+        <w:t xml:space="preserve">5. Ops Board — every order, scored live</w:t>
+      </w:r>
+      <w:r>
+        <w:rPr>
+          <w:color w:val="444444"/>
+          <w:sz w:val="18"/>
+          <w:szCs w:val="18"/>
+        </w:rPr>
+        <w:t xml:space="preserve">	(0:50)</w:t>
+      </w:r>
+    </w:p>
+    <w:tbl>
+      <w:tblPr>
+        <w:tblW w:type="dxa" w:w="9360"/>
+        <w:tblBorders>
+          <w:top w:val="none" w:color="FFFFFF" w:sz="0"/>
+          <w:left w:val="none" w:color="FFFFFF" w:sz="0"/>
+          <w:bottom w:val="none" w:color="FFFFFF" w:sz="0"/>
+          <w:right w:val="none" w:color="FFFFFF" w:sz="0"/>
+          <w:insideH w:val="none" w:color="FFFFFF" w:sz="0"/>
+          <w:insideV w:val="none" w:color="FFFFFF" w:sz="0"/>
+        </w:tblBorders>
+      </w:tblPr>
+      <w:tblGrid>
+        <w:gridCol w:w="1000"/>
+        <w:gridCol w:w="8360"/>
+      </w:tblGrid>
+      <w:tr>
+        <w:tc>
+          <w:tcPr>
+            <w:tcW w:type="dxa" w:w="1000"/>
+            <w:tcBorders>
+              <w:top w:val="none" w:color="FFFFFF" w:sz="0"/>
+              <w:left w:val="none" w:color="FFFFFF" w:sz="0"/>
+              <w:bottom w:val="none" w:color="FFFFFF" w:sz="0"/>
+              <w:right w:val="none" w:color="FFFFFF" w:sz="0"/>
+            </w:tcBorders>
+            <w:tcMar>
+              <w:top w:type="dxa" w:w="30"/>
+              <w:left w:type="dxa" w:w="0"/>
+              <w:bottom w:type="dxa" w:w="30"/>
+              <w:right w:type="dxa" w:w="160"/>
+            </w:tcMar>
+          </w:tcPr>
+          <w:p>
+            <w:r>
+              <w:rPr>
+                <w:b/>
+                <w:bCs/>
+                <w:color w:val="000000"/>
+                <w:sz w:val="20"/>
+                <w:szCs w:val="20"/>
+              </w:rPr>
+              <w:t xml:space="preserve">Show</w:t>
+            </w:r>
+          </w:p>
+        </w:tc>
+        <w:tc>
+          <w:tcPr>
+            <w:tcW w:type="dxa" w:w="8360"/>
+            <w:tcBorders>
+              <w:top w:val="none" w:color="FFFFFF" w:sz="0"/>
+              <w:left w:val="none" w:color="FFFFFF" w:sz="0"/>
+              <w:bottom w:val="none" w:color="FFFFFF" w:sz="0"/>
+              <w:right w:val="none" w:color="FFFFFF" w:sz="0"/>
+            </w:tcBorders>
+            <w:tcMar>
+              <w:top w:type="dxa" w:w="30"/>
+              <w:left w:type="dxa" w:w="0"/>
+              <w:bottom w:type="dxa" w:w="30"/>
+              <w:right w:type="dxa" w:w="0"/>
+            </w:tcMar>
+          </w:tcPr>
+          <w:p>
+            <w:pPr>
+              <w:spacing w:line="264"/>
+            </w:pPr>
+            <w:r>
+              <w:rPr>
+                <w:i w:val="false"/>
+                <w:iCs w:val="false"/>
+                <w:color w:val="000000"/>
+                <w:sz w:val="20"/>
+                <w:szCs w:val="20"/>
+              </w:rPr>
+              <w:t xml:space="preserve">Operations, Store #1234. A live list — every ticket, its channel (drive-thru, dine-in, mobile) and a score for order accuracy, quality, and prep. Along the top: throughput 41/hr, average order time 2m 47s, fryer oil 342°F, 14 open alerts.</w:t>
+            </w:r>
+          </w:p>
+        </w:tc>
+      </w:tr>
+      <w:tr>
+        <w:tc>
+          <w:tcPr>
+            <w:tcW w:type="dxa" w:w="1000"/>
+            <w:tcBorders>
+              <w:top w:val="none" w:color="FFFFFF" w:sz="0"/>
+              <w:left w:val="none" w:color="FFFFFF" w:sz="0"/>
+              <w:bottom w:val="none" w:color="FFFFFF" w:sz="0"/>
+              <w:right w:val="none" w:color="FFFFFF" w:sz="0"/>
+            </w:tcBorders>
+            <w:tcMar>
+              <w:top w:type="dxa" w:w="30"/>
+              <w:left w:type="dxa" w:w="0"/>
+              <w:bottom w:type="dxa" w:w="30"/>
+              <w:right w:type="dxa" w:w="160"/>
+            </w:tcMar>
+          </w:tcPr>
+          <w:p>
+            <w:r>
+              <w:rPr>
+                <w:b/>
+                <w:bCs/>
+                <w:color w:val="000000"/>
+                <w:sz w:val="20"/>
+                <w:szCs w:val="20"/>
+              </w:rPr>
+              <w:t xml:space="preserve">Say</w:t>
+            </w:r>
+          </w:p>
+        </w:tc>
+        <w:tc>
+          <w:tcPr>
+            <w:tcW w:type="dxa" w:w="8360"/>
+            <w:tcBorders>
+              <w:top w:val="none" w:color="FFFFFF" w:sz="0"/>
+              <w:left w:val="none" w:color="FFFFFF" w:sz="0"/>
+              <w:bottom w:val="none" w:color="FFFFFF" w:sz="0"/>
+              <w:right w:val="none" w:color="FFFFFF" w:sz="0"/>
+            </w:tcBorders>
+            <w:tcMar>
+              <w:top w:type="dxa" w:w="30"/>
+              <w:left w:type="dxa" w:w="0"/>
+              <w:bottom w:type="dxa" w:w="30"/>
+              <w:right w:type="dxa" w:w="0"/>
+            </w:tcMar>
+          </w:tcPr>
+          <w:p>
+            <w:pPr>
+              <w:spacing w:line="264"/>
+            </w:pPr>
+            <w:r>
+              <w:rPr>
+                <w:i w:val="false"/>
+                <w:iCs w:val="false"/>
+                <w:color w:val="000000"/>
+                <w:sz w:val="21"/>
+                <w:szCs w:val="21"/>
+              </w:rPr>
+              <w:t xml:space="preserve">“Everything rolls up here — every order, from every channel, scored as it happens. Green is clean, red needs a look. The manager sees the whole shift on one screen — even the fryer temperature and how long orders are taking.”</w:t>
+            </w:r>
+          </w:p>
+        </w:tc>
+      </w:tr>
+      <w:tr>
+        <w:tc>
+          <w:tcPr>
+            <w:tcW w:type="dxa" w:w="1000"/>
+            <w:tcBorders>
+              <w:top w:val="none" w:color="FFFFFF" w:sz="0"/>
+              <w:left w:val="none" w:color="FFFFFF" w:sz="0"/>
+              <w:bottom w:val="none" w:color="FFFFFF" w:sz="0"/>
+              <w:right w:val="none" w:color="FFFFFF" w:sz="0"/>
+            </w:tcBorders>
+            <w:tcMar>
+              <w:top w:type="dxa" w:w="30"/>
+              <w:left w:type="dxa" w:w="0"/>
+              <w:bottom w:type="dxa" w:w="30"/>
+              <w:right w:type="dxa" w:w="160"/>
+            </w:tcMar>
+          </w:tcPr>
+          <w:p>
+            <w:r>
+              <w:rPr>
+                <w:b/>
+                <w:bCs/>
+                <w:color w:val="000000"/>
+                <w:sz w:val="20"/>
+                <w:szCs w:val="20"/>
+              </w:rPr>
+              <w:t xml:space="preserve">Point</w:t>
+            </w:r>
+          </w:p>
+        </w:tc>
+        <w:tc>
+          <w:tcPr>
+            <w:tcW w:type="dxa" w:w="8360"/>
+            <w:tcBorders>
+              <w:top w:val="none" w:color="FFFFFF" w:sz="0"/>
+              <w:left w:val="none" w:color="FFFFFF" w:sz="0"/>
+              <w:bottom w:val="none" w:color="FFFFFF" w:sz="0"/>
+              <w:right w:val="none" w:color="FFFFFF" w:sz="0"/>
+            </w:tcBorders>
+            <w:tcMar>
+              <w:top w:type="dxa" w:w="30"/>
+              <w:left w:type="dxa" w:w="0"/>
+              <w:bottom w:type="dxa" w:w="30"/>
+              <w:right w:type="dxa" w:w="0"/>
+            </w:tcMar>
+          </w:tcPr>
+          <w:p>
+            <w:pPr>
+              <w:spacing w:line="264"/>
+            </w:pPr>
+            <w:r>
+              <w:rPr>
+                <w:i/>
+                <w:iCs/>
+                <w:color w:val="000000"/>
+                <w:sz w:val="20"/>
+                <w:szCs w:val="20"/>
+              </w:rPr>
+              <w:t xml:space="preserve">Run your finger down the ticket list; stop on a red ‘re-check’ row.</w:t>
+            </w:r>
+          </w:p>
+        </w:tc>
+      </w:tr>
+    </w:tbl>
+    <w:p>
+      <w:pPr>
+        <w:tabs>
+          <w:tab w:val="right" w:pos="9360"/>
+        </w:tabs>
+        <w:spacing w:after="40" w:before="220"/>
+      </w:pPr>
+      <w:r>
+        <w:rPr>
+          <w:b/>
+          <w:bCs/>
+          <w:color w:val="000000"/>
+          <w:sz w:val="22"/>
+          <w:szCs w:val="22"/>
+        </w:rPr>
+        <w:t xml:space="preserve">6. The back of house, too</w:t>
+      </w:r>
+      <w:r>
+        <w:rPr>
+          <w:color w:val="444444"/>
+          <w:sz w:val="18"/>
+          <w:szCs w:val="18"/>
+        </w:rPr>
+        <w:t xml:space="preserve">	(0:40)</w:t>
+      </w:r>
+    </w:p>
+    <w:tbl>
+      <w:tblPr>
+        <w:tblW w:type="dxa" w:w="9360"/>
+        <w:tblBorders>
+          <w:top w:val="none" w:color="FFFFFF" w:sz="0"/>
+          <w:left w:val="none" w:color="FFFFFF" w:sz="0"/>
+          <w:bottom w:val="none" w:color="FFFFFF" w:sz="0"/>
+          <w:right w:val="none" w:color="FFFFFF" w:sz="0"/>
+          <w:insideH w:val="none" w:color="FFFFFF" w:sz="0"/>
+          <w:insideV w:val="none" w:color="FFFFFF" w:sz="0"/>
+        </w:tblBorders>
+      </w:tblPr>
+      <w:tblGrid>
+        <w:gridCol w:w="1000"/>
+        <w:gridCol w:w="8360"/>
+      </w:tblGrid>
+      <w:tr>
+        <w:tc>
+          <w:tcPr>
+            <w:tcW w:type="dxa" w:w="1000"/>
+            <w:tcBorders>
+              <w:top w:val="none" w:color="FFFFFF" w:sz="0"/>
+              <w:left w:val="none" w:color="FFFFFF" w:sz="0"/>
+              <w:bottom w:val="none" w:color="FFFFFF" w:sz="0"/>
+              <w:right w:val="none" w:color="FFFFFF" w:sz="0"/>
+            </w:tcBorders>
+            <w:tcMar>
+              <w:top w:type="dxa" w:w="30"/>
+              <w:left w:type="dxa" w:w="0"/>
+              <w:bottom w:type="dxa" w:w="30"/>
+              <w:right w:type="dxa" w:w="160"/>
+            </w:tcMar>
+          </w:tcPr>
+          <w:p>
+            <w:r>
+              <w:rPr>
+                <w:b/>
+                <w:bCs/>
+                <w:color w:val="000000"/>
+                <w:sz w:val="20"/>
+                <w:szCs w:val="20"/>
+              </w:rPr>
+              <w:t xml:space="preserve">Show</w:t>
+            </w:r>
+          </w:p>
+        </w:tc>
+        <w:tc>
+          <w:tcPr>
+            <w:tcW w:type="dxa" w:w="8360"/>
+            <w:tcBorders>
+              <w:top w:val="none" w:color="FFFFFF" w:sz="0"/>
+              <w:left w:val="none" w:color="FFFFFF" w:sz="0"/>
+              <w:bottom w:val="none" w:color="FFFFFF" w:sz="0"/>
+              <w:right w:val="none" w:color="FFFFFF" w:sz="0"/>
+            </w:tcBorders>
+            <w:tcMar>
+              <w:top w:type="dxa" w:w="30"/>
+              <w:left w:type="dxa" w:w="0"/>
+              <w:bottom w:type="dxa" w:w="30"/>
+              <w:right w:type="dxa" w:w="0"/>
+            </w:tcMar>
+          </w:tcPr>
+          <w:p>
+            <w:pPr>
+              <w:spacing w:line="264"/>
+            </w:pPr>
+            <w:r>
+              <w:rPr>
+                <w:i w:val="false"/>
+                <w:iCs w:val="false"/>
+                <w:color w:val="000000"/>
+                <w:sz w:val="20"/>
+                <w:szCs w:val="20"/>
+              </w:rPr>
+              <w:t xml:space="preserve">Inventory — the storeroom shelves tracking stock (crinkle fries, tenders), the fryer, and the receiving door as deliveries arrive.</w:t>
+            </w:r>
+          </w:p>
+        </w:tc>
+      </w:tr>
+      <w:tr>
+        <w:tc>
+          <w:tcPr>
+            <w:tcW w:type="dxa" w:w="1000"/>
+            <w:tcBorders>
+              <w:top w:val="none" w:color="FFFFFF" w:sz="0"/>
+              <w:left w:val="none" w:color="FFFFFF" w:sz="0"/>
+              <w:bottom w:val="none" w:color="FFFFFF" w:sz="0"/>
+              <w:right w:val="none" w:color="FFFFFF" w:sz="0"/>
+            </w:tcBorders>
+            <w:tcMar>
+              <w:top w:type="dxa" w:w="30"/>
+              <w:left w:type="dxa" w:w="0"/>
+              <w:bottom w:type="dxa" w:w="30"/>
+              <w:right w:type="dxa" w:w="160"/>
+            </w:tcMar>
+          </w:tcPr>
+          <w:p>
+            <w:r>
+              <w:rPr>
+                <w:b/>
+                <w:bCs/>
+                <w:color w:val="000000"/>
+                <w:sz w:val="20"/>
+                <w:szCs w:val="20"/>
+              </w:rPr>
+              <w:t xml:space="preserve">Say</w:t>
+            </w:r>
+          </w:p>
+        </w:tc>
+        <w:tc>
+          <w:tcPr>
+            <w:tcW w:type="dxa" w:w="8360"/>
+            <w:tcBorders>
+              <w:top w:val="none" w:color="FFFFFF" w:sz="0"/>
+              <w:left w:val="none" w:color="FFFFFF" w:sz="0"/>
+              <w:bottom w:val="none" w:color="FFFFFF" w:sz="0"/>
+              <w:right w:val="none" w:color="FFFFFF" w:sz="0"/>
+            </w:tcBorders>
+            <w:tcMar>
+              <w:top w:type="dxa" w:w="30"/>
+              <w:left w:type="dxa" w:w="0"/>
+              <w:bottom w:type="dxa" w:w="30"/>
+              <w:right w:type="dxa" w:w="0"/>
+            </w:tcMar>
+          </w:tcPr>
+          <w:p>
+            <w:pPr>
+              <w:spacing w:line="264"/>
+            </w:pPr>
+            <w:r>
+              <w:rPr>
+                <w:i w:val="false"/>
+                <w:iCs w:val="false"/>
+                <w:color w:val="000000"/>
+                <w:sz w:val="21"/>
+                <w:szCs w:val="21"/>
+              </w:rPr>
+              <w:t xml:space="preserve">“It’s not just the front line. The same system watches the storeroom and the back door — what’s on the shelf, what’s running low, and what’s just been delivered. One platform, front to back.”</w:t>
+            </w:r>
+          </w:p>
+        </w:tc>
+      </w:tr>
+      <w:tr>
+        <w:tc>
+          <w:tcPr>
+            <w:tcW w:type="dxa" w:w="1000"/>
+            <w:tcBorders>
+              <w:top w:val="none" w:color="FFFFFF" w:sz="0"/>
+              <w:left w:val="none" w:color="FFFFFF" w:sz="0"/>
+              <w:bottom w:val="none" w:color="FFFFFF" w:sz="0"/>
+              <w:right w:val="none" w:color="FFFFFF" w:sz="0"/>
+            </w:tcBorders>
+            <w:tcMar>
+              <w:top w:type="dxa" w:w="30"/>
+              <w:left w:type="dxa" w:w="0"/>
+              <w:bottom w:type="dxa" w:w="30"/>
+              <w:right w:type="dxa" w:w="160"/>
+            </w:tcMar>
+          </w:tcPr>
+          <w:p>
+            <w:r>
+              <w:rPr>
+                <w:b/>
+                <w:bCs/>
+                <w:color w:val="000000"/>
+                <w:sz w:val="20"/>
+                <w:szCs w:val="20"/>
+              </w:rPr>
+              <w:t xml:space="preserve">Point</w:t>
+            </w:r>
+          </w:p>
+        </w:tc>
+        <w:tc>
+          <w:tcPr>
+            <w:tcW w:type="dxa" w:w="8360"/>
+            <w:tcBorders>
+              <w:top w:val="none" w:color="FFFFFF" w:sz="0"/>
+              <w:left w:val="none" w:color="FFFFFF" w:sz="0"/>
+              <w:bottom w:val="none" w:color="FFFFFF" w:sz="0"/>
+              <w:right w:val="none" w:color="FFFFFF" w:sz="0"/>
+            </w:tcBorders>
+            <w:tcMar>
+              <w:top w:type="dxa" w:w="30"/>
+              <w:left w:type="dxa" w:w="0"/>
+              <w:bottom w:type="dxa" w:w="30"/>
+              <w:right w:type="dxa" w:w="0"/>
+            </w:tcMar>
+          </w:tcPr>
+          <w:p>
+            <w:pPr>
+              <w:spacing w:line="264"/>
+            </w:pPr>
+            <w:r>
+              <w:rPr>
+                <w:i/>
+                <w:iCs/>
+                <w:color w:val="000000"/>
+                <w:sz w:val="20"/>
+                <w:szCs w:val="20"/>
+              </w:rPr>
+              <w:t xml:space="preserve">Point to a tracked box on the shelf, then the receiving-door camera.</w:t>
+            </w:r>
+          </w:p>
+        </w:tc>
+      </w:tr>
+    </w:tbl>
+    <w:p>
+      <w:pPr>
+        <w:tabs>
+          <w:tab w:val="right" w:pos="9360"/>
+        </w:tabs>
+        <w:spacing w:after="40" w:before="220"/>
+      </w:pPr>
+      <w:r>
+        <w:rPr>
+          <w:b/>
+          <w:bCs/>
+          <w:color w:val="000000"/>
+          <w:sz w:val="22"/>
+          <w:szCs w:val="22"/>
+        </w:rPr>
+        <w:t xml:space="preserve">7. The numbers that add up</w:t>
+      </w:r>
+      <w:r>
+        <w:rPr>
+          <w:color w:val="444444"/>
+          <w:sz w:val="18"/>
+          <w:szCs w:val="18"/>
+        </w:rPr>
+        <w:t xml:space="preserve">	(0:35)</w:t>
+      </w:r>
+    </w:p>
+    <w:tbl>
+      <w:tblPr>
+        <w:tblW w:type="dxa" w:w="9360"/>
+        <w:tblBorders>
+          <w:top w:val="none" w:color="FFFFFF" w:sz="0"/>
+          <w:left w:val="none" w:color="FFFFFF" w:sz="0"/>
+          <w:bottom w:val="none" w:color="FFFFFF" w:sz="0"/>
+          <w:right w:val="none" w:color="FFFFFF" w:sz="0"/>
+          <w:insideH w:val="none" w:color="FFFFFF" w:sz="0"/>
+          <w:insideV w:val="none" w:color="FFFFFF" w:sz="0"/>
+        </w:tblBorders>
+      </w:tblPr>
+      <w:tblGrid>
+        <w:gridCol w:w="1000"/>
+        <w:gridCol w:w="8360"/>
+      </w:tblGrid>
+      <w:tr>
+        <w:tc>
+          <w:tcPr>
+            <w:tcW w:type="dxa" w:w="1000"/>
+            <w:tcBorders>
+              <w:top w:val="none" w:color="FFFFFF" w:sz="0"/>
+              <w:left w:val="none" w:color="FFFFFF" w:sz="0"/>
+              <w:bottom w:val="none" w:color="FFFFFF" w:sz="0"/>
+              <w:right w:val="none" w:color="FFFFFF" w:sz="0"/>
+            </w:tcBorders>
+            <w:tcMar>
+              <w:top w:type="dxa" w:w="30"/>
+              <w:left w:type="dxa" w:w="0"/>
+              <w:bottom w:type="dxa" w:w="30"/>
+              <w:right w:type="dxa" w:w="160"/>
+            </w:tcMar>
+          </w:tcPr>
+          <w:p>
+            <w:r>
+              <w:rPr>
+                <w:b/>
+                <w:bCs/>
+                <w:color w:val="000000"/>
+                <w:sz w:val="20"/>
+                <w:szCs w:val="20"/>
+              </w:rPr>
+              <w:t xml:space="preserve">Show</w:t>
+            </w:r>
+          </w:p>
+        </w:tc>
+        <w:tc>
+          <w:tcPr>
+            <w:tcW w:type="dxa" w:w="8360"/>
+            <w:tcBorders>
+              <w:top w:val="none" w:color="FFFFFF" w:sz="0"/>
+              <w:left w:val="none" w:color="FFFFFF" w:sz="0"/>
+              <w:bottom w:val="none" w:color="FFFFFF" w:sz="0"/>
+              <w:right w:val="none" w:color="FFFFFF" w:sz="0"/>
+            </w:tcBorders>
+            <w:tcMar>
+              <w:top w:type="dxa" w:w="30"/>
+              <w:left w:type="dxa" w:w="0"/>
+              <w:bottom w:type="dxa" w:w="30"/>
+              <w:right w:type="dxa" w:w="0"/>
+            </w:tcMar>
+          </w:tcPr>
+          <w:p>
+            <w:pPr>
+              <w:spacing w:line="264"/>
+            </w:pPr>
+            <w:r>
+              <w:rPr>
+                <w:i w:val="false"/>
+                <w:iCs w:val="false"/>
+                <w:color w:val="000000"/>
+                <w:sz w:val="20"/>
+                <w:szCs w:val="20"/>
+              </w:rPr>
+              <w:t xml:space="preserve">Insights and Alerts — the shift’s key numbers (accuracy, speed, food safety, waste) and a live list of what needs attention.</w:t>
+            </w:r>
+          </w:p>
+        </w:tc>
+      </w:tr>
+      <w:tr>
+        <w:tc>
+          <w:tcPr>
+            <w:tcW w:type="dxa" w:w="1000"/>
+            <w:tcBorders>
+              <w:top w:val="none" w:color="FFFFFF" w:sz="0"/>
+              <w:left w:val="none" w:color="FFFFFF" w:sz="0"/>
+              <w:bottom w:val="none" w:color="FFFFFF" w:sz="0"/>
+              <w:right w:val="none" w:color="FFFFFF" w:sz="0"/>
+            </w:tcBorders>
+            <w:tcMar>
+              <w:top w:type="dxa" w:w="30"/>
+              <w:left w:type="dxa" w:w="0"/>
+              <w:bottom w:type="dxa" w:w="30"/>
+              <w:right w:type="dxa" w:w="160"/>
+            </w:tcMar>
+          </w:tcPr>
+          <w:p>
+            <w:r>
+              <w:rPr>
+                <w:b/>
+                <w:bCs/>
+                <w:color w:val="000000"/>
+                <w:sz w:val="20"/>
+                <w:szCs w:val="20"/>
+              </w:rPr>
+              <w:t xml:space="preserve">Say</w:t>
+            </w:r>
+          </w:p>
+        </w:tc>
+        <w:tc>
+          <w:tcPr>
+            <w:tcW w:type="dxa" w:w="8360"/>
+            <w:tcBorders>
+              <w:top w:val="none" w:color="FFFFFF" w:sz="0"/>
+              <w:left w:val="none" w:color="FFFFFF" w:sz="0"/>
+              <w:bottom w:val="none" w:color="FFFFFF" w:sz="0"/>
+              <w:right w:val="none" w:color="FFFFFF" w:sz="0"/>
+            </w:tcBorders>
+            <w:tcMar>
+              <w:top w:type="dxa" w:w="30"/>
+              <w:left w:type="dxa" w:w="0"/>
+              <w:bottom w:type="dxa" w:w="30"/>
+              <w:right w:type="dxa" w:w="0"/>
+            </w:tcMar>
+          </w:tcPr>
+          <w:p>
+            <w:pPr>
+              <w:spacing w:line="264"/>
+            </w:pPr>
+            <w:r>
+              <w:rPr>
+                <w:i w:val="false"/>
+                <w:iCs w:val="false"/>
+                <w:color w:val="000000"/>
+                <w:sz w:val="21"/>
+                <w:szCs w:val="21"/>
+              </w:rPr>
+              <w:t xml:space="preserve">“And it adds up to the numbers a manager and an owner actually use — accuracy, speed, food safety, waste — with a live list of what needs a look. Ready for the next audit, with nobody filling in a clipboard.”</w:t>
+            </w:r>
+          </w:p>
+        </w:tc>
+      </w:tr>
+      <w:tr>
+        <w:tc>
+          <w:tcPr>
+            <w:tcW w:type="dxa" w:w="1000"/>
+            <w:tcBorders>
+              <w:top w:val="none" w:color="FFFFFF" w:sz="0"/>
+              <w:left w:val="none" w:color="FFFFFF" w:sz="0"/>
+              <w:bottom w:val="none" w:color="FFFFFF" w:sz="0"/>
+              <w:right w:val="none" w:color="FFFFFF" w:sz="0"/>
+            </w:tcBorders>
+            <w:tcMar>
+              <w:top w:type="dxa" w:w="30"/>
+              <w:left w:type="dxa" w:w="0"/>
+              <w:bottom w:type="dxa" w:w="30"/>
+              <w:right w:type="dxa" w:w="160"/>
+            </w:tcMar>
+          </w:tcPr>
+          <w:p>
+            <w:r>
+              <w:rPr>
+                <w:b/>
+                <w:bCs/>
+                <w:color w:val="000000"/>
+                <w:sz w:val="20"/>
+                <w:szCs w:val="20"/>
+              </w:rPr>
+              <w:t xml:space="preserve">Point</w:t>
+            </w:r>
+          </w:p>
+        </w:tc>
+        <w:tc>
+          <w:tcPr>
+            <w:tcW w:type="dxa" w:w="8360"/>
+            <w:tcBorders>
+              <w:top w:val="none" w:color="FFFFFF" w:sz="0"/>
+              <w:left w:val="none" w:color="FFFFFF" w:sz="0"/>
+              <w:bottom w:val="none" w:color="FFFFFF" w:sz="0"/>
+              <w:right w:val="none" w:color="FFFFFF" w:sz="0"/>
+            </w:tcBorders>
+            <w:tcMar>
+              <w:top w:type="dxa" w:w="30"/>
+              <w:left w:type="dxa" w:w="0"/>
+              <w:bottom w:type="dxa" w:w="30"/>
+              <w:right w:type="dxa" w:w="0"/>
+            </w:tcMar>
+          </w:tcPr>
+          <w:p>
+            <w:pPr>
+              <w:spacing w:line="264"/>
+            </w:pPr>
+            <w:r>
+              <w:rPr>
+                <w:i/>
+                <w:iCs/>
+                <w:color w:val="000000"/>
+                <w:sz w:val="20"/>
+                <w:szCs w:val="20"/>
+              </w:rPr>
+              <w:t xml:space="preserve">Point to one number, then the alert list.</w:t>
+            </w:r>
+          </w:p>
+        </w:tc>
+      </w:tr>
+    </w:tbl>
+    <w:p>
+      <w:pPr>
+        <w:tabs>
+          <w:tab w:val="right" w:pos="9360"/>
+        </w:tabs>
+        <w:spacing w:after="40" w:before="220"/>
+      </w:pPr>
+      <w:r>
+        <w:rPr>
+          <w:b/>
+          <w:bCs/>
+          <w:color w:val="000000"/>
+          <w:sz w:val="22"/>
+          <w:szCs w:val="22"/>
+        </w:rPr>
+        <w:t xml:space="preserve">8. Recap</w:t>
+      </w:r>
+      <w:r>
+        <w:rPr>
+          <w:color w:val="444444"/>
+          <w:sz w:val="18"/>
+          <w:szCs w:val="18"/>
+        </w:rPr>
+        <w:t xml:space="preserve">	(0:20)</w:t>
+      </w:r>
+    </w:p>
+    <w:tbl>
+      <w:tblPr>
+        <w:tblW w:type="dxa" w:w="9360"/>
+        <w:tblBorders>
+          <w:top w:val="none" w:color="FFFFFF" w:sz="0"/>
+          <w:left w:val="none" w:color="FFFFFF" w:sz="0"/>
+          <w:bottom w:val="none" w:color="FFFFFF" w:sz="0"/>
+          <w:right w:val="none" w:color="FFFFFF" w:sz="0"/>
+          <w:insideH w:val="none" w:color="FFFFFF" w:sz="0"/>
+          <w:insideV w:val="none" w:color="FFFFFF" w:sz="0"/>
+        </w:tblBorders>
+      </w:tblPr>
+      <w:tblGrid>
+        <w:gridCol w:w="1000"/>
+        <w:gridCol w:w="8360"/>
+      </w:tblGrid>
+      <w:tr>
+        <w:tc>
+          <w:tcPr>
+            <w:tcW w:type="dxa" w:w="1000"/>
+            <w:tcBorders>
+              <w:top w:val="none" w:color="FFFFFF" w:sz="0"/>
+              <w:left w:val="none" w:color="FFFFFF" w:sz="0"/>
+              <w:bottom w:val="none" w:color="FFFFFF" w:sz="0"/>
+              <w:right w:val="none" w:color="FFFFFF" w:sz="0"/>
+            </w:tcBorders>
+            <w:tcMar>
+              <w:top w:type="dxa" w:w="30"/>
+              <w:left w:type="dxa" w:w="0"/>
+              <w:bottom w:type="dxa" w:w="30"/>
+              <w:right w:type="dxa" w:w="160"/>
+            </w:tcMar>
+          </w:tcPr>
+          <w:p>
+            <w:r>
+              <w:rPr>
+                <w:b/>
+                <w:bCs/>
+                <w:color w:val="000000"/>
+                <w:sz w:val="20"/>
+                <w:szCs w:val="20"/>
+              </w:rPr>
+              <w:t xml:space="preserve">Say</w:t>
+            </w:r>
+          </w:p>
+        </w:tc>
+        <w:tc>
+          <w:tcPr>
+            <w:tcW w:type="dxa" w:w="8360"/>
+            <w:tcBorders>
+              <w:top w:val="none" w:color="FFFFFF" w:sz="0"/>
+              <w:left w:val="none" w:color="FFFFFF" w:sz="0"/>
+              <w:bottom w:val="none" w:color="FFFFFF" w:sz="0"/>
+              <w:right w:val="none" w:color="FFFFFF" w:sz="0"/>
+            </w:tcBorders>
+            <w:tcMar>
+              <w:top w:type="dxa" w:w="30"/>
+              <w:left w:type="dxa" w:w="0"/>
+              <w:bottom w:type="dxa" w:w="30"/>
+              <w:right w:type="dxa" w:w="0"/>
+            </w:tcMar>
+          </w:tcPr>
+          <w:p>
+            <w:pPr>
+              <w:spacing w:line="264"/>
+            </w:pPr>
+            <w:r>
+              <w:rPr>
+                <w:i w:val="false"/>
+                <w:iCs w:val="false"/>
+                <w:color w:val="000000"/>
                 <w:sz w:val="21"/>
                 <w:szCs w:val="21"/>
               </w:rPr>
@@ -2129,7 +3424,7 @@
         <w:pBdr>
           <w:bottom w:val="single" w:color="000000" w:sz="8" w:space="4"/>
         </w:pBdr>
-        <w:spacing w:after="120" w:before="300"/>
+        <w:spacing w:after="120" w:before="320"/>
       </w:pPr>
       <w:r>
         <w:rPr>
@@ -2157,7 +3452,7 @@
           <w:sz w:val="20"/>
           <w:szCs w:val="20"/>
         </w:rPr>
-        <w:t xml:space="preserve">Bring it home: “It runs on your existing kitchen cameras, on a small box on-site. Nothing goes to the cloud.”</w:t>
+        <w:t xml:space="preserve">Bring it home: “Two products, one platform. It runs on your existing cameras, on a small box on-site. Nothing goes to the cloud.”</w:t>
       </w:r>
     </w:p>
     <w:p>
@@ -2175,7 +3470,7 @@
           <w:sz w:val="20"/>
           <w:szCs w:val="20"/>
         </w:rPr>
-        <w:t xml:space="preserve">The ask: “Give us three weeks in one of your restaurants and we’ll show you these same results on your own line.”</w:t>
+        <w:t xml:space="preserve">The ask: “Give us three weeks in one store or one restaurant and we’ll show you these same results on your own floor.”</w:t>
       </w:r>
     </w:p>
     <w:p>
@@ -2201,7 +3496,7 @@
         <w:pBdr>
           <w:bottom w:val="single" w:color="000000" w:sz="8" w:space="4"/>
         </w:pBdr>
-        <w:spacing w:after="120" w:before="300"/>
+        <w:spacing w:after="120" w:before="320"/>
       </w:pPr>
       <w:r>
         <w:rPr>
@@ -2226,7 +3521,7 @@
           <w:sz w:val="20"/>
           <w:szCs w:val="20"/>
         </w:rPr>
-        <w:t xml:space="preserve">Is this scoring our staff?</w:t>
+        <w:t xml:space="preserve">Is this recording faces?</w:t>
       </w:r>
     </w:p>
     <w:p>
@@ -2239,7 +3534,7 @@
           <w:sz w:val="20"/>
           <w:szCs w:val="20"/>
         </w:rPr>
-        <w:t xml:space="preserve">It scores the food and the order, not the person. No faces are stored, and nothing leaves the store — it all runs on the box on-site.</w:t>
+        <w:t xml:space="preserve">No faces are stored and no video leaves the site. In the store it only matches loyalty opt-ins; in the kitchen it scores the food, not the person. Everything runs on the box on-site.</w:t>
       </w:r>
     </w:p>
     <w:p>
@@ -2267,7 +3562,7 @@
           <w:sz w:val="20"/>
           <w:szCs w:val="20"/>
         </w:rPr>
-        <w:t xml:space="preserve">Every alert comes with the picture, so a person can glance and confirm. You set how strict each station is.</w:t>
+        <w:t xml:space="preserve">Every alert comes with the picture, so a person can glance and confirm. You set how strict it is, per site and per station.</w:t>
       </w:r>
     </w:p>
     <w:p>
@@ -2295,7 +3590,7 @@
           <w:sz w:val="20"/>
           <w:szCs w:val="20"/>
         </w:rPr>
-        <w:t xml:space="preserve">No — it uses the kitchen cameras you already have. Just one small box added on-site.</w:t>
+        <w:t xml:space="preserve">No — it uses the cameras you already have. Just one small box added on-site.</w:t>
       </w:r>
     </w:p>
     <w:p>
@@ -2351,7 +3646,7 @@
           <w:sz w:val="20"/>
           <w:szCs w:val="20"/>
         </w:rPr>
-        <w:t xml:space="preserve">It connects to your order screens (POS / kitchen display) and can send alerts to a screen or a phone.</w:t>
+        <w:t xml:space="preserve">It connects to your POS / kitchen screens and can send alerts to a screen or a phone.</w:t>
       </w:r>
     </w:p>
     <w:p>
@@ -2379,7 +3674,7 @@
           <w:sz w:val="20"/>
           <w:szCs w:val="20"/>
         </w:rPr>
-        <w:t xml:space="preserve">A three-week trial in one restaurant — real results on your own line by week three.</w:t>
+        <w:t xml:space="preserve">A three-week trial in one location — real results on your own floor by week three.</w:t>
       </w:r>
     </w:p>
     <w:sectPr>

</xml_diff>

<commit_message>
Remove the inventory / back-of-house step from Fabric Lens demo
Dropped "The back of house, too" (storeroom + receiving) from Part B and
renumbered the remaining steps. Fabric Lens is now 7 steps (~4:45); both
demos together ~9:05. Updated the Word (.docx) and PDF/HTML versions.

Co-Authored-By: Claude Opus 4.8 <noreply@anthropic.com>
Claude-Session: https://claude.ai/code/session_01E1oR723ai5CKXUc9it1VkB
</commit_message>
<xml_diff>
--- a/deck/EdgeVision-Demo-Script.docx
+++ b/deck/EdgeVision-Demo-Script.docx
@@ -43,7 +43,7 @@
           <w:sz w:val="18"/>
           <w:szCs w:val="18"/>
         </w:rPr>
-        <w:t xml:space="preserve">About 9:45 for both · Pattern AI Labs</w:t>
+        <w:t xml:space="preserve">About 9:05 for both · Pattern AI Labs</w:t>
       </w:r>
     </w:p>
     <w:p>
@@ -1560,7 +1560,7 @@
           <w:sz w:val="18"/>
           <w:szCs w:val="18"/>
         </w:rPr>
-        <w:t xml:space="preserve">	about 5:25</w:t>
+        <w:t xml:space="preserve">	about 4:45</w:t>
       </w:r>
     </w:p>
     <w:p>
@@ -2864,7 +2864,7 @@
           <w:sz w:val="22"/>
           <w:szCs w:val="22"/>
         </w:rPr>
-        <w:t xml:space="preserve">6. The back of house, too</w:t>
+        <w:t xml:space="preserve">6. The numbers that add up</w:t>
       </w:r>
       <w:r>
         <w:rPr>
@@ -2872,7 +2872,7 @@
           <w:sz w:val="18"/>
           <w:szCs w:val="18"/>
         </w:rPr>
-        <w:t xml:space="preserve">	(0:40)</w:t>
+        <w:t xml:space="preserve">	(0:35)</w:t>
       </w:r>
     </w:p>
     <w:tbl>
@@ -2949,7 +2949,7 @@
                 <w:sz w:val="20"/>
                 <w:szCs w:val="20"/>
               </w:rPr>
-              <w:t xml:space="preserve">Inventory — the storeroom shelves tracking stock (crinkle fries, tenders), the fryer, and the receiving door as deliveries arrive.</w:t>
+              <w:t xml:space="preserve">Insights and Alerts — the shift’s key numbers (accuracy, speed, food safety, waste) and a live list of what needs attention.</w:t>
             </w:r>
           </w:p>
         </w:tc>
@@ -3012,7 +3012,7 @@
                 <w:sz w:val="21"/>
                 <w:szCs w:val="21"/>
               </w:rPr>
-              <w:t xml:space="preserve">“It’s not just the front line. The same system watches the storeroom and the back door — what’s on the shelf, what’s running low, and what’s just been delivered. One platform, front to back.”</w:t>
+              <w:t xml:space="preserve">“And it adds up to the numbers a manager and an owner actually use — accuracy, speed, food safety, waste — with a live list of what needs a look. Ready for the next audit, with nobody filling in a clipboard.”</w:t>
             </w:r>
           </w:p>
         </w:tc>
@@ -3075,7 +3075,7 @@
                 <w:sz w:val="20"/>
                 <w:szCs w:val="20"/>
               </w:rPr>
-              <w:t xml:space="preserve">Point to a tracked box on the shelf, then the receiving-door camera.</w:t>
+              <w:t xml:space="preserve">Point to one number, then the alert list.</w:t>
             </w:r>
           </w:p>
         </w:tc>
@@ -3096,239 +3096,7 @@
           <w:sz w:val="22"/>
           <w:szCs w:val="22"/>
         </w:rPr>
-        <w:t xml:space="preserve">7. The numbers that add up</w:t>
-      </w:r>
-      <w:r>
-        <w:rPr>
-          <w:color w:val="444444"/>
-          <w:sz w:val="18"/>
-          <w:szCs w:val="18"/>
-        </w:rPr>
-        <w:t xml:space="preserve">	(0:35)</w:t>
-      </w:r>
-    </w:p>
-    <w:tbl>
-      <w:tblPr>
-        <w:tblW w:type="dxa" w:w="9360"/>
-        <w:tblBorders>
-          <w:top w:val="none" w:color="FFFFFF" w:sz="0"/>
-          <w:left w:val="none" w:color="FFFFFF" w:sz="0"/>
-          <w:bottom w:val="none" w:color="FFFFFF" w:sz="0"/>
-          <w:right w:val="none" w:color="FFFFFF" w:sz="0"/>
-          <w:insideH w:val="none" w:color="FFFFFF" w:sz="0"/>
-          <w:insideV w:val="none" w:color="FFFFFF" w:sz="0"/>
-        </w:tblBorders>
-      </w:tblPr>
-      <w:tblGrid>
-        <w:gridCol w:w="1000"/>
-        <w:gridCol w:w="8360"/>
-      </w:tblGrid>
-      <w:tr>
-        <w:tc>
-          <w:tcPr>
-            <w:tcW w:type="dxa" w:w="1000"/>
-            <w:tcBorders>
-              <w:top w:val="none" w:color="FFFFFF" w:sz="0"/>
-              <w:left w:val="none" w:color="FFFFFF" w:sz="0"/>
-              <w:bottom w:val="none" w:color="FFFFFF" w:sz="0"/>
-              <w:right w:val="none" w:color="FFFFFF" w:sz="0"/>
-            </w:tcBorders>
-            <w:tcMar>
-              <w:top w:type="dxa" w:w="30"/>
-              <w:left w:type="dxa" w:w="0"/>
-              <w:bottom w:type="dxa" w:w="30"/>
-              <w:right w:type="dxa" w:w="160"/>
-            </w:tcMar>
-          </w:tcPr>
-          <w:p>
-            <w:r>
-              <w:rPr>
-                <w:b/>
-                <w:bCs/>
-                <w:color w:val="000000"/>
-                <w:sz w:val="20"/>
-                <w:szCs w:val="20"/>
-              </w:rPr>
-              <w:t xml:space="preserve">Show</w:t>
-            </w:r>
-          </w:p>
-        </w:tc>
-        <w:tc>
-          <w:tcPr>
-            <w:tcW w:type="dxa" w:w="8360"/>
-            <w:tcBorders>
-              <w:top w:val="none" w:color="FFFFFF" w:sz="0"/>
-              <w:left w:val="none" w:color="FFFFFF" w:sz="0"/>
-              <w:bottom w:val="none" w:color="FFFFFF" w:sz="0"/>
-              <w:right w:val="none" w:color="FFFFFF" w:sz="0"/>
-            </w:tcBorders>
-            <w:tcMar>
-              <w:top w:type="dxa" w:w="30"/>
-              <w:left w:type="dxa" w:w="0"/>
-              <w:bottom w:type="dxa" w:w="30"/>
-              <w:right w:type="dxa" w:w="0"/>
-            </w:tcMar>
-          </w:tcPr>
-          <w:p>
-            <w:pPr>
-              <w:spacing w:line="264"/>
-            </w:pPr>
-            <w:r>
-              <w:rPr>
-                <w:i w:val="false"/>
-                <w:iCs w:val="false"/>
-                <w:color w:val="000000"/>
-                <w:sz w:val="20"/>
-                <w:szCs w:val="20"/>
-              </w:rPr>
-              <w:t xml:space="preserve">Insights and Alerts — the shift’s key numbers (accuracy, speed, food safety, waste) and a live list of what needs attention.</w:t>
-            </w:r>
-          </w:p>
-        </w:tc>
-      </w:tr>
-      <w:tr>
-        <w:tc>
-          <w:tcPr>
-            <w:tcW w:type="dxa" w:w="1000"/>
-            <w:tcBorders>
-              <w:top w:val="none" w:color="FFFFFF" w:sz="0"/>
-              <w:left w:val="none" w:color="FFFFFF" w:sz="0"/>
-              <w:bottom w:val="none" w:color="FFFFFF" w:sz="0"/>
-              <w:right w:val="none" w:color="FFFFFF" w:sz="0"/>
-            </w:tcBorders>
-            <w:tcMar>
-              <w:top w:type="dxa" w:w="30"/>
-              <w:left w:type="dxa" w:w="0"/>
-              <w:bottom w:type="dxa" w:w="30"/>
-              <w:right w:type="dxa" w:w="160"/>
-            </w:tcMar>
-          </w:tcPr>
-          <w:p>
-            <w:r>
-              <w:rPr>
-                <w:b/>
-                <w:bCs/>
-                <w:color w:val="000000"/>
-                <w:sz w:val="20"/>
-                <w:szCs w:val="20"/>
-              </w:rPr>
-              <w:t xml:space="preserve">Say</w:t>
-            </w:r>
-          </w:p>
-        </w:tc>
-        <w:tc>
-          <w:tcPr>
-            <w:tcW w:type="dxa" w:w="8360"/>
-            <w:tcBorders>
-              <w:top w:val="none" w:color="FFFFFF" w:sz="0"/>
-              <w:left w:val="none" w:color="FFFFFF" w:sz="0"/>
-              <w:bottom w:val="none" w:color="FFFFFF" w:sz="0"/>
-              <w:right w:val="none" w:color="FFFFFF" w:sz="0"/>
-            </w:tcBorders>
-            <w:tcMar>
-              <w:top w:type="dxa" w:w="30"/>
-              <w:left w:type="dxa" w:w="0"/>
-              <w:bottom w:type="dxa" w:w="30"/>
-              <w:right w:type="dxa" w:w="0"/>
-            </w:tcMar>
-          </w:tcPr>
-          <w:p>
-            <w:pPr>
-              <w:spacing w:line="264"/>
-            </w:pPr>
-            <w:r>
-              <w:rPr>
-                <w:i w:val="false"/>
-                <w:iCs w:val="false"/>
-                <w:color w:val="000000"/>
-                <w:sz w:val="21"/>
-                <w:szCs w:val="21"/>
-              </w:rPr>
-              <w:t xml:space="preserve">“And it adds up to the numbers a manager and an owner actually use — accuracy, speed, food safety, waste — with a live list of what needs a look. Ready for the next audit, with nobody filling in a clipboard.”</w:t>
-            </w:r>
-          </w:p>
-        </w:tc>
-      </w:tr>
-      <w:tr>
-        <w:tc>
-          <w:tcPr>
-            <w:tcW w:type="dxa" w:w="1000"/>
-            <w:tcBorders>
-              <w:top w:val="none" w:color="FFFFFF" w:sz="0"/>
-              <w:left w:val="none" w:color="FFFFFF" w:sz="0"/>
-              <w:bottom w:val="none" w:color="FFFFFF" w:sz="0"/>
-              <w:right w:val="none" w:color="FFFFFF" w:sz="0"/>
-            </w:tcBorders>
-            <w:tcMar>
-              <w:top w:type="dxa" w:w="30"/>
-              <w:left w:type="dxa" w:w="0"/>
-              <w:bottom w:type="dxa" w:w="30"/>
-              <w:right w:type="dxa" w:w="160"/>
-            </w:tcMar>
-          </w:tcPr>
-          <w:p>
-            <w:r>
-              <w:rPr>
-                <w:b/>
-                <w:bCs/>
-                <w:color w:val="000000"/>
-                <w:sz w:val="20"/>
-                <w:szCs w:val="20"/>
-              </w:rPr>
-              <w:t xml:space="preserve">Point</w:t>
-            </w:r>
-          </w:p>
-        </w:tc>
-        <w:tc>
-          <w:tcPr>
-            <w:tcW w:type="dxa" w:w="8360"/>
-            <w:tcBorders>
-              <w:top w:val="none" w:color="FFFFFF" w:sz="0"/>
-              <w:left w:val="none" w:color="FFFFFF" w:sz="0"/>
-              <w:bottom w:val="none" w:color="FFFFFF" w:sz="0"/>
-              <w:right w:val="none" w:color="FFFFFF" w:sz="0"/>
-            </w:tcBorders>
-            <w:tcMar>
-              <w:top w:type="dxa" w:w="30"/>
-              <w:left w:type="dxa" w:w="0"/>
-              <w:bottom w:type="dxa" w:w="30"/>
-              <w:right w:type="dxa" w:w="0"/>
-            </w:tcMar>
-          </w:tcPr>
-          <w:p>
-            <w:pPr>
-              <w:spacing w:line="264"/>
-            </w:pPr>
-            <w:r>
-              <w:rPr>
-                <w:i/>
-                <w:iCs/>
-                <w:color w:val="000000"/>
-                <w:sz w:val="20"/>
-                <w:szCs w:val="20"/>
-              </w:rPr>
-              <w:t xml:space="preserve">Point to one number, then the alert list.</w:t>
-            </w:r>
-          </w:p>
-        </w:tc>
-      </w:tr>
-    </w:tbl>
-    <w:p>
-      <w:pPr>
-        <w:tabs>
-          <w:tab w:val="right" w:pos="9360"/>
-        </w:tabs>
-        <w:spacing w:after="40" w:before="220"/>
-      </w:pPr>
-      <w:r>
-        <w:rPr>
-          <w:b/>
-          <w:bCs/>
-          <w:color w:val="000000"/>
-          <w:sz w:val="22"/>
-          <w:szCs w:val="22"/>
-        </w:rPr>
-        <w:t xml:space="preserve">8. Recap</w:t>
+        <w:t xml:space="preserve">7. Recap</w:t>
       </w:r>
       <w:r>
         <w:rPr>

</xml_diff>